<commit_message>
SEQUOIADBMAINSTREAM-1744 修改query task新增skip和returnNum参数 更新接口文档
git-svn-id: http://192.168.20.11/sequoiadb/trunk@23207 6121f079-4a18-41d3-8c30-8870a322f2c2
</commit_message>
<xml_diff>
--- a/internal_doc/03.开发设计/OM/Story-OMSvc.docx
+++ b/internal_doc/03.开发设计/OM/Story-OMSvc.docx
@@ -4530,12 +4530,55 @@
           <w:p>
             <w:pPr>
               <w:ind w:left="0"/>
+              <w:rPr>
+                <w:ins w:id="1" w:author="linyoubin" w:date="2016-05-23T11:00:00Z"/>
+              </w:rPr>
             </w:pPr>
             <w:r>
               <w:rPr>
                 <w:rFonts w:hint="eastAsia"/>
               </w:rPr>
               <w:t>hint: object</w:t>
+            </w:r>
+          </w:p>
+          <w:p>
+            <w:pPr>
+              <w:ind w:left="0"/>
+            </w:pPr>
+            <w:r>
+              <w:rPr>
+                <w:rFonts w:hint="eastAsia"/>
+              </w:rPr>
+              <w:t>skip:</w:t>
+            </w:r>
+            <w:r>
+              <w:rPr>
+                <w:rFonts w:hint="eastAsia"/>
+              </w:rPr>
+              <w:t>跳过记录数</w:t>
+            </w:r>
+          </w:p>
+          <w:p>
+            <w:pPr>
+              <w:ind w:left="0"/>
+            </w:pPr>
+            <w:r>
+              <w:rPr>
+                <w:rFonts w:hint="eastAsia"/>
+              </w:rPr>
+              <w:t>limit</w:t>
+            </w:r>
+            <w:r>
+              <w:rPr>
+                <w:rFonts w:hint="eastAsia"/>
+              </w:rPr>
+              <w:t>:</w:t>
+            </w:r>
+            <w:r>
+              <w:rPr>
+                <w:rFonts w:hint="eastAsia"/>
+              </w:rPr>
+              <w:t>查询记录数</w:t>
             </w:r>
           </w:p>
         </w:tc>
@@ -5069,6 +5112,7 @@
         <w:rPr>
           <w:rFonts w:hint="eastAsia"/>
         </w:rPr>
+        <w:lastRenderedPageBreak/>
         <w:t>扫描主机</w:t>
       </w:r>
       <w:r>
@@ -5151,7 +5195,6 @@
               <w:rPr>
                 <w:rFonts w:hint="eastAsia"/>
               </w:rPr>
-              <w:lastRenderedPageBreak/>
               <w:t>请求头</w:t>
             </w:r>
           </w:p>
@@ -6636,6 +6679,7 @@
               <w:rPr>
                 <w:rFonts w:hint="eastAsia"/>
               </w:rPr>
+              <w:lastRenderedPageBreak/>
               <w:t>说明</w:t>
             </w:r>
           </w:p>
@@ -6675,7 +6719,6 @@
         <w:rPr>
           <w:rFonts w:hint="eastAsia"/>
         </w:rPr>
-        <w:lastRenderedPageBreak/>
         <w:t>检测</w:t>
       </w:r>
       <w:r>
@@ -7964,6 +8007,7 @@
               <w:ind w:left="0" w:firstLineChars="150" w:firstLine="315"/>
             </w:pPr>
             <w:r>
+              <w:lastRenderedPageBreak/>
               <w:t>Net</w:t>
             </w:r>
             <w:r>
@@ -8015,7 +8059,6 @@
               <w:ind w:left="0" w:firstLineChars="150" w:firstLine="315"/>
             </w:pPr>
             <w:r>
-              <w:lastRenderedPageBreak/>
               <w:t>Safety</w:t>
             </w:r>
             <w:r>
@@ -8234,6 +8277,7 @@
               <w:ind w:left="0" w:firstLineChars="150" w:firstLine="315"/>
             </w:pPr>
             <w:r>
+              <w:lastRenderedPageBreak/>
               <w:t>"OM"</w:t>
             </w:r>
             <w:r>
@@ -8267,14 +8311,458 @@
               <w:ind w:left="0" w:firstLineChars="300" w:firstLine="630"/>
             </w:pPr>
             <w:r>
+              <w:t>"Version"</w:t>
+            </w:r>
+            <w:r>
+              <w:t xml:space="preserve">: </w:t>
+            </w:r>
+            <w:r>
+              <w:t xml:space="preserve">"1.8", </w:t>
+            </w:r>
+          </w:p>
+          <w:p>
+            <w:pPr>
+              <w:ind w:left="0" w:firstLineChars="300" w:firstLine="630"/>
+            </w:pPr>
+            <w:r>
+              <w:t>"Path"</w:t>
+            </w:r>
+            <w:r>
+              <w:t xml:space="preserve">: </w:t>
+            </w:r>
+            <w:r>
+              <w:t xml:space="preserve">"/home/mount/sequoiadb/trunk//bin/", </w:t>
+            </w:r>
+          </w:p>
+          <w:p>
+            <w:pPr>
+              <w:ind w:left="0" w:firstLineChars="300" w:firstLine="630"/>
+            </w:pPr>
+            <w:r>
+              <w:t>"Port"</w:t>
+            </w:r>
+            <w:r>
+              <w:t xml:space="preserve">: </w:t>
+            </w:r>
+            <w:r>
+              <w:t xml:space="preserve">"11790", </w:t>
+            </w:r>
+          </w:p>
+          <w:p>
+            <w:pPr>
+              <w:ind w:left="0" w:firstLineChars="300" w:firstLine="630"/>
+            </w:pPr>
+            <w:r>
+              <w:t>"Release"</w:t>
+            </w:r>
+            <w:r>
+              <w:t xml:space="preserve">: </w:t>
+            </w:r>
+            <w:r>
+              <w:t xml:space="preserve">15427 </w:t>
+            </w:r>
+          </w:p>
+          <w:p>
+            <w:pPr>
+              <w:ind w:left="0" w:firstLineChars="150" w:firstLine="315"/>
+            </w:pPr>
+            <w:r>
+              <w:t xml:space="preserve">}, </w:t>
+            </w:r>
+          </w:p>
+          <w:p>
+            <w:pPr>
+              <w:ind w:left="0" w:firstLineChars="150" w:firstLine="315"/>
+            </w:pPr>
+            <w:r>
+              <w:t>"CPU"</w:t>
+            </w:r>
+            <w:r>
+              <w:t xml:space="preserve">: </w:t>
+            </w:r>
+          </w:p>
+          <w:p>
+            <w:pPr>
+              <w:ind w:left="0" w:firstLineChars="150" w:firstLine="315"/>
+            </w:pPr>
+            <w:r>
+              <w:t xml:space="preserve">[ </w:t>
+            </w:r>
+          </w:p>
+          <w:p>
+            <w:pPr>
+              <w:ind w:left="0" w:firstLineChars="300" w:firstLine="630"/>
+            </w:pPr>
+            <w:r>
+              <w:t>{</w:t>
+            </w:r>
+          </w:p>
+          <w:p>
+            <w:pPr>
+              <w:ind w:left="0" w:firstLineChars="450" w:firstLine="945"/>
+            </w:pPr>
+            <w:r>
+              <w:t>"ID"</w:t>
+            </w:r>
+            <w:r>
+              <w:t xml:space="preserve">: </w:t>
+            </w:r>
+            <w:r>
+              <w:t xml:space="preserve">"", </w:t>
+            </w:r>
+          </w:p>
+          <w:p>
+            <w:pPr>
+              <w:ind w:left="0" w:firstLineChars="450" w:firstLine="945"/>
+            </w:pPr>
+            <w:r>
+              <w:t>"Model"</w:t>
+            </w:r>
+            <w:r>
+              <w:t xml:space="preserve">: </w:t>
+            </w:r>
+            <w:r>
+              <w:t xml:space="preserve">"", </w:t>
+            </w:r>
+          </w:p>
+          <w:p>
+            <w:pPr>
+              <w:ind w:left="0" w:firstLineChars="450" w:firstLine="945"/>
+            </w:pPr>
+            <w:r>
+              <w:t>"Core"</w:t>
+            </w:r>
+            <w:r>
+              <w:t xml:space="preserve">: </w:t>
+            </w:r>
+            <w:r>
+              <w:t xml:space="preserve">4, </w:t>
+            </w:r>
+          </w:p>
+          <w:p>
+            <w:pPr>
+              <w:ind w:left="0" w:firstLineChars="450" w:firstLine="945"/>
+            </w:pPr>
+            <w:r>
+              <w:t>"Freq"</w:t>
+            </w:r>
+            <w:r>
+              <w:t xml:space="preserve">: </w:t>
+            </w:r>
+            <w:r>
+              <w:t xml:space="preserve">"2.00GHz" </w:t>
+            </w:r>
+          </w:p>
+          <w:p>
+            <w:pPr>
+              <w:ind w:left="0" w:firstLineChars="300" w:firstLine="630"/>
+            </w:pPr>
+            <w:r>
+              <w:t xml:space="preserve">} </w:t>
+            </w:r>
+          </w:p>
+          <w:p>
+            <w:pPr>
+              <w:ind w:left="0" w:firstLineChars="150" w:firstLine="315"/>
+            </w:pPr>
+            <w:r>
+              <w:t xml:space="preserve">], </w:t>
+            </w:r>
+          </w:p>
+          <w:p>
+            <w:pPr>
+              <w:ind w:left="0" w:firstLineChars="150" w:firstLine="315"/>
+            </w:pPr>
+            <w:r>
+              <w:t>"Memory"</w:t>
+            </w:r>
+            <w:r>
+              <w:t xml:space="preserve">: </w:t>
+            </w:r>
+          </w:p>
+          <w:p>
+            <w:pPr>
+              <w:ind w:left="0" w:firstLineChars="150" w:firstLine="315"/>
+            </w:pPr>
+            <w:r>
+              <w:t>{</w:t>
+            </w:r>
+          </w:p>
+          <w:p>
+            <w:pPr>
+              <w:ind w:left="0" w:firstLineChars="300" w:firstLine="630"/>
+            </w:pPr>
+            <w:r>
+              <w:t>"Model"</w:t>
+            </w:r>
+            <w:r>
+              <w:t xml:space="preserve">: </w:t>
+            </w:r>
+            <w:r>
+              <w:t xml:space="preserve">"", </w:t>
+            </w:r>
+          </w:p>
+          <w:p>
+            <w:pPr>
+              <w:ind w:left="0" w:firstLineChars="300" w:firstLine="630"/>
+            </w:pPr>
+            <w:r>
+              <w:t>"Size"</w:t>
+            </w:r>
+            <w:r>
+              <w:t xml:space="preserve">: </w:t>
+            </w:r>
+            <w:r>
+              <w:t xml:space="preserve">3833, </w:t>
+            </w:r>
+          </w:p>
+          <w:p>
+            <w:pPr>
+              <w:ind w:left="0" w:firstLineChars="300" w:firstLine="630"/>
+            </w:pPr>
+            <w:r>
+              <w:t>"Free"</w:t>
+            </w:r>
+            <w:r>
+              <w:t xml:space="preserve">: </w:t>
+            </w:r>
+            <w:r>
+              <w:t xml:space="preserve">1136 </w:t>
+            </w:r>
+          </w:p>
+          <w:p>
+            <w:pPr>
+              <w:ind w:left="0" w:firstLineChars="150" w:firstLine="315"/>
+            </w:pPr>
+            <w:r>
+              <w:t xml:space="preserve">}, </w:t>
+            </w:r>
+          </w:p>
+          <w:p>
+            <w:pPr>
+              <w:ind w:left="0" w:firstLineChars="150" w:firstLine="315"/>
+            </w:pPr>
+            <w:r>
+              <w:t>"Net"</w:t>
+            </w:r>
+            <w:r>
+              <w:t xml:space="preserve">: </w:t>
+            </w:r>
+          </w:p>
+          <w:p>
+            <w:pPr>
+              <w:ind w:left="0" w:firstLineChars="150" w:firstLine="315"/>
+            </w:pPr>
+            <w:r>
+              <w:t xml:space="preserve">[ </w:t>
+            </w:r>
+          </w:p>
+          <w:p>
+            <w:pPr>
+              <w:ind w:left="0" w:firstLineChars="300" w:firstLine="630"/>
+            </w:pPr>
+            <w:r>
+              <w:t xml:space="preserve">{ </w:t>
+            </w:r>
+          </w:p>
+          <w:p>
+            <w:pPr>
+              <w:ind w:left="0" w:firstLineChars="450" w:firstLine="945"/>
+            </w:pPr>
+            <w:r>
+              <w:t>"Name"</w:t>
+            </w:r>
+            <w:r>
+              <w:t xml:space="preserve">: </w:t>
+            </w:r>
+            <w:r>
+              <w:t xml:space="preserve">"lo", </w:t>
+            </w:r>
+          </w:p>
+          <w:p>
+            <w:pPr>
+              <w:ind w:left="0" w:firstLineChars="450" w:firstLine="945"/>
+            </w:pPr>
+            <w:r>
+              <w:t>"Model"</w:t>
+            </w:r>
+            <w:r>
+              <w:t xml:space="preserve">: </w:t>
+            </w:r>
+            <w:r>
+              <w:t xml:space="preserve">"", </w:t>
+            </w:r>
+          </w:p>
+          <w:p>
+            <w:pPr>
+              <w:ind w:left="0" w:firstLineChars="450" w:firstLine="945"/>
+            </w:pPr>
+            <w:r>
+              <w:t>"Bandwidth"</w:t>
+            </w:r>
+            <w:r>
+              <w:t xml:space="preserve">: </w:t>
+            </w:r>
+            <w:r>
+              <w:t xml:space="preserve">"", </w:t>
+            </w:r>
+          </w:p>
+          <w:p>
+            <w:pPr>
+              <w:ind w:left="0" w:firstLineChars="450" w:firstLine="945"/>
+            </w:pPr>
+            <w:r>
+              <w:t>"IP"</w:t>
+            </w:r>
+            <w:r>
+              <w:t xml:space="preserve">: </w:t>
+            </w:r>
+            <w:r>
+              <w:t xml:space="preserve">"127.0.0.1" </w:t>
+            </w:r>
+          </w:p>
+          <w:p>
+            <w:pPr>
+              <w:ind w:left="0" w:firstLineChars="300" w:firstLine="630"/>
+            </w:pPr>
+            <w:r>
+              <w:t>},</w:t>
+            </w:r>
+          </w:p>
+          <w:p>
+            <w:pPr>
+              <w:ind w:leftChars="170" w:firstLineChars="100" w:firstLine="210"/>
+            </w:pPr>
+            <w:r>
+              <w:t xml:space="preserve">{ </w:t>
+            </w:r>
+          </w:p>
+          <w:p>
+            <w:pPr>
+              <w:ind w:left="0" w:firstLineChars="500" w:firstLine="1050"/>
+            </w:pPr>
+            <w:r>
+              <w:t>"Name"</w:t>
+            </w:r>
+            <w:r>
+              <w:t xml:space="preserve">: </w:t>
+            </w:r>
+            <w:r>
+              <w:t xml:space="preserve">"eth1", </w:t>
+            </w:r>
+          </w:p>
+          <w:p>
+            <w:pPr>
+              <w:ind w:left="0" w:firstLineChars="500" w:firstLine="1050"/>
+            </w:pPr>
+            <w:r>
+              <w:t>"Model"</w:t>
+            </w:r>
+            <w:r>
+              <w:t xml:space="preserve">: </w:t>
+            </w:r>
+            <w:r>
+              <w:t xml:space="preserve">"", </w:t>
+            </w:r>
+          </w:p>
+          <w:p>
+            <w:pPr>
+              <w:ind w:left="0" w:firstLineChars="500" w:firstLine="1050"/>
+            </w:pPr>
+            <w:r>
+              <w:t>"Bandwidth"</w:t>
+            </w:r>
+            <w:r>
+              <w:t xml:space="preserve">: </w:t>
+            </w:r>
+            <w:r>
+              <w:t xml:space="preserve">"", </w:t>
+            </w:r>
+          </w:p>
+          <w:p>
+            <w:pPr>
+              <w:ind w:left="0" w:firstLineChars="500" w:firstLine="1050"/>
+            </w:pPr>
+            <w:r>
+              <w:t>"IP"</w:t>
+            </w:r>
+            <w:r>
+              <w:t xml:space="preserve">: </w:t>
+            </w:r>
+            <w:r>
+              <w:t xml:space="preserve">"192.168.20.197" </w:t>
+            </w:r>
+          </w:p>
+          <w:p>
+            <w:pPr>
+              <w:ind w:left="0" w:firstLineChars="300" w:firstLine="630"/>
+            </w:pPr>
+            <w:r>
+              <w:t xml:space="preserve">} </w:t>
+            </w:r>
+          </w:p>
+          <w:p>
+            <w:pPr>
+              <w:ind w:left="0" w:firstLineChars="150" w:firstLine="315"/>
+            </w:pPr>
+            <w:r>
+              <w:t xml:space="preserve">], </w:t>
+            </w:r>
+          </w:p>
+          <w:p>
+            <w:pPr>
+              <w:ind w:left="0" w:firstLineChars="150" w:firstLine="315"/>
+            </w:pPr>
+            <w:r>
+              <w:t>"Port"</w:t>
+            </w:r>
+            <w:r>
+              <w:t xml:space="preserve">: </w:t>
+            </w:r>
+          </w:p>
+          <w:p>
+            <w:pPr>
+              <w:ind w:left="0" w:firstLineChars="150" w:firstLine="315"/>
+            </w:pPr>
+            <w:r>
+              <w:t xml:space="preserve">[ </w:t>
+            </w:r>
+          </w:p>
+          <w:p>
+            <w:pPr>
+              <w:ind w:left="0" w:firstLineChars="300" w:firstLine="630"/>
+            </w:pPr>
+            <w:r>
+              <w:t xml:space="preserve">{ </w:t>
+            </w:r>
+          </w:p>
+          <w:p>
+            <w:pPr>
+              <w:ind w:left="0" w:firstLineChars="450" w:firstLine="945"/>
+            </w:pPr>
+            <w:r>
+              <w:t>"Port"</w:t>
+            </w:r>
+            <w:r>
+              <w:t xml:space="preserve">: </w:t>
+            </w:r>
+            <w:r>
+              <w:t xml:space="preserve">"", </w:t>
+            </w:r>
+          </w:p>
+          <w:p>
+            <w:pPr>
+              <w:ind w:left="0" w:firstLineChars="450" w:firstLine="945"/>
+            </w:pPr>
+            <w:r>
               <w:lastRenderedPageBreak/>
-              <w:t>"Version"</w:t>
-            </w:r>
-            <w:r>
-              <w:t xml:space="preserve">: </w:t>
-            </w:r>
-            <w:r>
-              <w:t xml:space="preserve">"1.8", </w:t>
+              <w:t>"CanUse"</w:t>
+            </w:r>
+            <w:r>
+              <w:t xml:space="preserve">: </w:t>
+            </w:r>
+            <w:r>
+              <w:t xml:space="preserve">false </w:t>
             </w:r>
           </w:p>
           <w:p>
@@ -8282,41 +8770,7 @@
               <w:ind w:left="0" w:firstLineChars="300" w:firstLine="630"/>
             </w:pPr>
             <w:r>
-              <w:t>"Path"</w:t>
-            </w:r>
-            <w:r>
-              <w:t xml:space="preserve">: </w:t>
-            </w:r>
-            <w:r>
-              <w:t xml:space="preserve">"/home/mount/sequoiadb/trunk//bin/", </w:t>
-            </w:r>
-          </w:p>
-          <w:p>
-            <w:pPr>
-              <w:ind w:left="0" w:firstLineChars="300" w:firstLine="630"/>
-            </w:pPr>
-            <w:r>
-              <w:t>"Port"</w:t>
-            </w:r>
-            <w:r>
-              <w:t xml:space="preserve">: </w:t>
-            </w:r>
-            <w:r>
-              <w:t xml:space="preserve">"11790", </w:t>
-            </w:r>
-          </w:p>
-          <w:p>
-            <w:pPr>
-              <w:ind w:left="0" w:firstLineChars="300" w:firstLine="630"/>
-            </w:pPr>
-            <w:r>
-              <w:t>"Release"</w:t>
-            </w:r>
-            <w:r>
-              <w:t xml:space="preserve">: </w:t>
-            </w:r>
-            <w:r>
-              <w:t xml:space="preserve">15427 </w:t>
+              <w:t xml:space="preserve">} </w:t>
             </w:r>
           </w:p>
           <w:p>
@@ -8324,7 +8778,7 @@
               <w:ind w:left="0" w:firstLineChars="150" w:firstLine="315"/>
             </w:pPr>
             <w:r>
-              <w:t xml:space="preserve">}, </w:t>
+              <w:t xml:space="preserve">], </w:t>
             </w:r>
           </w:p>
           <w:p>
@@ -8332,417 +8786,6 @@
               <w:ind w:left="0" w:firstLineChars="150" w:firstLine="315"/>
             </w:pPr>
             <w:r>
-              <w:t>"CPU"</w:t>
-            </w:r>
-            <w:r>
-              <w:t xml:space="preserve">: </w:t>
-            </w:r>
-          </w:p>
-          <w:p>
-            <w:pPr>
-              <w:ind w:left="0" w:firstLineChars="150" w:firstLine="315"/>
-            </w:pPr>
-            <w:r>
-              <w:t xml:space="preserve">[ </w:t>
-            </w:r>
-          </w:p>
-          <w:p>
-            <w:pPr>
-              <w:ind w:left="0" w:firstLineChars="300" w:firstLine="630"/>
-            </w:pPr>
-            <w:r>
-              <w:t>{</w:t>
-            </w:r>
-          </w:p>
-          <w:p>
-            <w:pPr>
-              <w:ind w:left="0" w:firstLineChars="450" w:firstLine="945"/>
-            </w:pPr>
-            <w:r>
-              <w:t>"ID"</w:t>
-            </w:r>
-            <w:r>
-              <w:t xml:space="preserve">: </w:t>
-            </w:r>
-            <w:r>
-              <w:t xml:space="preserve">"", </w:t>
-            </w:r>
-          </w:p>
-          <w:p>
-            <w:pPr>
-              <w:ind w:left="0" w:firstLineChars="450" w:firstLine="945"/>
-            </w:pPr>
-            <w:r>
-              <w:t>"Model"</w:t>
-            </w:r>
-            <w:r>
-              <w:t xml:space="preserve">: </w:t>
-            </w:r>
-            <w:r>
-              <w:t xml:space="preserve">"", </w:t>
-            </w:r>
-          </w:p>
-          <w:p>
-            <w:pPr>
-              <w:ind w:left="0" w:firstLineChars="450" w:firstLine="945"/>
-            </w:pPr>
-            <w:r>
-              <w:t>"Core"</w:t>
-            </w:r>
-            <w:r>
-              <w:t xml:space="preserve">: </w:t>
-            </w:r>
-            <w:r>
-              <w:t xml:space="preserve">4, </w:t>
-            </w:r>
-          </w:p>
-          <w:p>
-            <w:pPr>
-              <w:ind w:left="0" w:firstLineChars="450" w:firstLine="945"/>
-            </w:pPr>
-            <w:r>
-              <w:t>"Freq"</w:t>
-            </w:r>
-            <w:r>
-              <w:t xml:space="preserve">: </w:t>
-            </w:r>
-            <w:r>
-              <w:t xml:space="preserve">"2.00GHz" </w:t>
-            </w:r>
-          </w:p>
-          <w:p>
-            <w:pPr>
-              <w:ind w:left="0" w:firstLineChars="300" w:firstLine="630"/>
-            </w:pPr>
-            <w:r>
-              <w:t xml:space="preserve">} </w:t>
-            </w:r>
-          </w:p>
-          <w:p>
-            <w:pPr>
-              <w:ind w:left="0" w:firstLineChars="150" w:firstLine="315"/>
-            </w:pPr>
-            <w:r>
-              <w:t xml:space="preserve">], </w:t>
-            </w:r>
-          </w:p>
-          <w:p>
-            <w:pPr>
-              <w:ind w:left="0" w:firstLineChars="150" w:firstLine="315"/>
-            </w:pPr>
-            <w:r>
-              <w:t>"Memory"</w:t>
-            </w:r>
-            <w:r>
-              <w:t xml:space="preserve">: </w:t>
-            </w:r>
-          </w:p>
-          <w:p>
-            <w:pPr>
-              <w:ind w:left="0" w:firstLineChars="150" w:firstLine="315"/>
-            </w:pPr>
-            <w:r>
-              <w:t>{</w:t>
-            </w:r>
-          </w:p>
-          <w:p>
-            <w:pPr>
-              <w:ind w:left="0" w:firstLineChars="300" w:firstLine="630"/>
-            </w:pPr>
-            <w:r>
-              <w:t>"Model"</w:t>
-            </w:r>
-            <w:r>
-              <w:t xml:space="preserve">: </w:t>
-            </w:r>
-            <w:r>
-              <w:t xml:space="preserve">"", </w:t>
-            </w:r>
-          </w:p>
-          <w:p>
-            <w:pPr>
-              <w:ind w:left="0" w:firstLineChars="300" w:firstLine="630"/>
-            </w:pPr>
-            <w:r>
-              <w:t>"Size"</w:t>
-            </w:r>
-            <w:r>
-              <w:t xml:space="preserve">: </w:t>
-            </w:r>
-            <w:r>
-              <w:t xml:space="preserve">3833, </w:t>
-            </w:r>
-          </w:p>
-          <w:p>
-            <w:pPr>
-              <w:ind w:left="0" w:firstLineChars="300" w:firstLine="630"/>
-            </w:pPr>
-            <w:r>
-              <w:t>"Free"</w:t>
-            </w:r>
-            <w:r>
-              <w:t xml:space="preserve">: </w:t>
-            </w:r>
-            <w:r>
-              <w:t xml:space="preserve">1136 </w:t>
-            </w:r>
-          </w:p>
-          <w:p>
-            <w:pPr>
-              <w:ind w:left="0" w:firstLineChars="150" w:firstLine="315"/>
-            </w:pPr>
-            <w:r>
-              <w:t xml:space="preserve">}, </w:t>
-            </w:r>
-          </w:p>
-          <w:p>
-            <w:pPr>
-              <w:ind w:left="0" w:firstLineChars="150" w:firstLine="315"/>
-            </w:pPr>
-            <w:r>
-              <w:t>"Net"</w:t>
-            </w:r>
-            <w:r>
-              <w:t xml:space="preserve">: </w:t>
-            </w:r>
-          </w:p>
-          <w:p>
-            <w:pPr>
-              <w:ind w:left="0" w:firstLineChars="150" w:firstLine="315"/>
-            </w:pPr>
-            <w:r>
-              <w:t xml:space="preserve">[ </w:t>
-            </w:r>
-          </w:p>
-          <w:p>
-            <w:pPr>
-              <w:ind w:left="0" w:firstLineChars="300" w:firstLine="630"/>
-            </w:pPr>
-            <w:r>
-              <w:t xml:space="preserve">{ </w:t>
-            </w:r>
-          </w:p>
-          <w:p>
-            <w:pPr>
-              <w:ind w:left="0" w:firstLineChars="450" w:firstLine="945"/>
-            </w:pPr>
-            <w:r>
-              <w:t>"Name"</w:t>
-            </w:r>
-            <w:r>
-              <w:t xml:space="preserve">: </w:t>
-            </w:r>
-            <w:r>
-              <w:t xml:space="preserve">"lo", </w:t>
-            </w:r>
-          </w:p>
-          <w:p>
-            <w:pPr>
-              <w:ind w:left="0" w:firstLineChars="450" w:firstLine="945"/>
-            </w:pPr>
-            <w:r>
-              <w:t>"Model"</w:t>
-            </w:r>
-            <w:r>
-              <w:t xml:space="preserve">: </w:t>
-            </w:r>
-            <w:r>
-              <w:t xml:space="preserve">"", </w:t>
-            </w:r>
-          </w:p>
-          <w:p>
-            <w:pPr>
-              <w:ind w:left="0" w:firstLineChars="450" w:firstLine="945"/>
-            </w:pPr>
-            <w:r>
-              <w:t>"Bandwidth"</w:t>
-            </w:r>
-            <w:r>
-              <w:t xml:space="preserve">: </w:t>
-            </w:r>
-            <w:r>
-              <w:t xml:space="preserve">"", </w:t>
-            </w:r>
-          </w:p>
-          <w:p>
-            <w:pPr>
-              <w:ind w:left="0" w:firstLineChars="450" w:firstLine="945"/>
-            </w:pPr>
-            <w:r>
-              <w:t>"IP"</w:t>
-            </w:r>
-            <w:r>
-              <w:t xml:space="preserve">: </w:t>
-            </w:r>
-            <w:r>
-              <w:t xml:space="preserve">"127.0.0.1" </w:t>
-            </w:r>
-          </w:p>
-          <w:p>
-            <w:pPr>
-              <w:ind w:left="0" w:firstLineChars="300" w:firstLine="630"/>
-            </w:pPr>
-            <w:r>
-              <w:t>},</w:t>
-            </w:r>
-          </w:p>
-          <w:p>
-            <w:pPr>
-              <w:ind w:leftChars="170" w:firstLineChars="100" w:firstLine="210"/>
-            </w:pPr>
-            <w:r>
-              <w:t xml:space="preserve">{ </w:t>
-            </w:r>
-          </w:p>
-          <w:p>
-            <w:pPr>
-              <w:ind w:left="0" w:firstLineChars="500" w:firstLine="1050"/>
-            </w:pPr>
-            <w:r>
-              <w:t>"Name"</w:t>
-            </w:r>
-            <w:r>
-              <w:t xml:space="preserve">: </w:t>
-            </w:r>
-            <w:r>
-              <w:t xml:space="preserve">"eth1", </w:t>
-            </w:r>
-          </w:p>
-          <w:p>
-            <w:pPr>
-              <w:ind w:left="0" w:firstLineChars="500" w:firstLine="1050"/>
-            </w:pPr>
-            <w:r>
-              <w:t>"Model"</w:t>
-            </w:r>
-            <w:r>
-              <w:t xml:space="preserve">: </w:t>
-            </w:r>
-            <w:r>
-              <w:t xml:space="preserve">"", </w:t>
-            </w:r>
-          </w:p>
-          <w:p>
-            <w:pPr>
-              <w:ind w:left="0" w:firstLineChars="500" w:firstLine="1050"/>
-            </w:pPr>
-            <w:r>
-              <w:t>"Bandwidth"</w:t>
-            </w:r>
-            <w:r>
-              <w:t xml:space="preserve">: </w:t>
-            </w:r>
-            <w:r>
-              <w:t xml:space="preserve">"", </w:t>
-            </w:r>
-          </w:p>
-          <w:p>
-            <w:pPr>
-              <w:ind w:left="0" w:firstLineChars="500" w:firstLine="1050"/>
-            </w:pPr>
-            <w:r>
-              <w:t>"IP"</w:t>
-            </w:r>
-            <w:r>
-              <w:t xml:space="preserve">: </w:t>
-            </w:r>
-            <w:r>
-              <w:t xml:space="preserve">"192.168.20.197" </w:t>
-            </w:r>
-          </w:p>
-          <w:p>
-            <w:pPr>
-              <w:ind w:left="0" w:firstLineChars="300" w:firstLine="630"/>
-            </w:pPr>
-            <w:r>
-              <w:t xml:space="preserve">} </w:t>
-            </w:r>
-          </w:p>
-          <w:p>
-            <w:pPr>
-              <w:ind w:left="0" w:firstLineChars="150" w:firstLine="315"/>
-            </w:pPr>
-            <w:r>
-              <w:t xml:space="preserve">], </w:t>
-            </w:r>
-          </w:p>
-          <w:p>
-            <w:pPr>
-              <w:ind w:left="0" w:firstLineChars="150" w:firstLine="315"/>
-            </w:pPr>
-            <w:r>
-              <w:t>"Port"</w:t>
-            </w:r>
-            <w:r>
-              <w:t xml:space="preserve">: </w:t>
-            </w:r>
-          </w:p>
-          <w:p>
-            <w:pPr>
-              <w:ind w:left="0" w:firstLineChars="150" w:firstLine="315"/>
-            </w:pPr>
-            <w:r>
-              <w:t xml:space="preserve">[ </w:t>
-            </w:r>
-          </w:p>
-          <w:p>
-            <w:pPr>
-              <w:ind w:left="0" w:firstLineChars="300" w:firstLine="630"/>
-            </w:pPr>
-            <w:r>
-              <w:t xml:space="preserve">{ </w:t>
-            </w:r>
-          </w:p>
-          <w:p>
-            <w:pPr>
-              <w:ind w:left="0" w:firstLineChars="450" w:firstLine="945"/>
-            </w:pPr>
-            <w:r>
-              <w:t>"Port"</w:t>
-            </w:r>
-            <w:r>
-              <w:t xml:space="preserve">: </w:t>
-            </w:r>
-            <w:r>
-              <w:t xml:space="preserve">"", </w:t>
-            </w:r>
-          </w:p>
-          <w:p>
-            <w:pPr>
-              <w:ind w:left="0" w:firstLineChars="450" w:firstLine="945"/>
-            </w:pPr>
-            <w:r>
-              <w:t>"CanUse"</w:t>
-            </w:r>
-            <w:r>
-              <w:t xml:space="preserve">: </w:t>
-            </w:r>
-            <w:r>
-              <w:t xml:space="preserve">false </w:t>
-            </w:r>
-          </w:p>
-          <w:p>
-            <w:pPr>
-              <w:ind w:left="0" w:firstLineChars="300" w:firstLine="630"/>
-            </w:pPr>
-            <w:r>
-              <w:t xml:space="preserve">} </w:t>
-            </w:r>
-          </w:p>
-          <w:p>
-            <w:pPr>
-              <w:ind w:left="0" w:firstLineChars="150" w:firstLine="315"/>
-            </w:pPr>
-            <w:r>
-              <w:t xml:space="preserve">], </w:t>
-            </w:r>
-          </w:p>
-          <w:p>
-            <w:pPr>
-              <w:ind w:left="0" w:firstLineChars="150" w:firstLine="315"/>
-            </w:pPr>
-            <w:r>
-              <w:lastRenderedPageBreak/>
               <w:t>"Service"</w:t>
             </w:r>
             <w:r>
@@ -9303,6 +9346,7 @@
               <w:rPr>
                 <w:rFonts w:hint="eastAsia"/>
               </w:rPr>
+              <w:lastRenderedPageBreak/>
               <w:t xml:space="preserve">omsvc ---&gt; </w:t>
             </w:r>
             <w:r>
@@ -9379,7 +9423,6 @@
               <w:rPr>
                 <w:rFonts w:hint="eastAsia"/>
               </w:rPr>
-              <w:lastRenderedPageBreak/>
               <w:t xml:space="preserve">omsvc ---&gt; </w:t>
             </w:r>
             <w:r>
@@ -10282,6 +10325,7 @@
               <w:rPr>
                 <w:rFonts w:hint="eastAsia"/>
               </w:rPr>
+              <w:lastRenderedPageBreak/>
               <w:t xml:space="preserve">  }, </w:t>
             </w:r>
             <w:r>
@@ -10330,7 +10374,6 @@
               <w:rPr>
                 <w:rFonts w:hint="eastAsia"/>
               </w:rPr>
-              <w:lastRenderedPageBreak/>
               <w:t>Passwd</w:t>
             </w:r>
             <w:r>
@@ -10717,6 +10760,7 @@
               <w:ind w:left="0" w:firstLineChars="600" w:firstLine="1260"/>
             </w:pPr>
             <w:r>
+              <w:lastRenderedPageBreak/>
               <w:t>"Model"</w:t>
             </w:r>
             <w:r>
@@ -10757,6 +10801,457 @@
           <w:p>
             <w:pPr>
               <w:ind w:left="0" w:firstLineChars="450" w:firstLine="945"/>
+            </w:pPr>
+            <w:r>
+              <w:t>},</w:t>
+            </w:r>
+          </w:p>
+          <w:p>
+            <w:pPr>
+              <w:ind w:left="0" w:firstLineChars="450" w:firstLine="945"/>
+            </w:pPr>
+            <w:r>
+              <w:t>"Net"</w:t>
+            </w:r>
+            <w:r>
+              <w:t xml:space="preserve">: </w:t>
+            </w:r>
+          </w:p>
+          <w:p>
+            <w:pPr>
+              <w:ind w:left="0" w:firstLineChars="450" w:firstLine="945"/>
+            </w:pPr>
+            <w:r>
+              <w:t>[</w:t>
+            </w:r>
+          </w:p>
+          <w:p>
+            <w:pPr>
+              <w:ind w:left="0" w:firstLineChars="600" w:firstLine="1260"/>
+            </w:pPr>
+            <w:r>
+              <w:t>{</w:t>
+            </w:r>
+          </w:p>
+          <w:p>
+            <w:pPr>
+              <w:ind w:left="0" w:firstLineChars="750" w:firstLine="1575"/>
+            </w:pPr>
+            <w:r>
+              <w:t>"Name"</w:t>
+            </w:r>
+            <w:r>
+              <w:t xml:space="preserve">: </w:t>
+            </w:r>
+            <w:r>
+              <w:t>"lo",</w:t>
+            </w:r>
+          </w:p>
+          <w:p>
+            <w:pPr>
+              <w:ind w:left="0" w:firstLineChars="750" w:firstLine="1575"/>
+            </w:pPr>
+            <w:r>
+              <w:t>"Model"</w:t>
+            </w:r>
+            <w:r>
+              <w:t xml:space="preserve">: </w:t>
+            </w:r>
+            <w:r>
+              <w:t>"",</w:t>
+            </w:r>
+          </w:p>
+          <w:p>
+            <w:pPr>
+              <w:ind w:left="0" w:firstLineChars="750" w:firstLine="1575"/>
+            </w:pPr>
+            <w:r>
+              <w:t>"Bandwidth"</w:t>
+            </w:r>
+            <w:r>
+              <w:t xml:space="preserve">: </w:t>
+            </w:r>
+            <w:r>
+              <w:t>"",</w:t>
+            </w:r>
+          </w:p>
+          <w:p>
+            <w:pPr>
+              <w:ind w:left="0" w:firstLineChars="750" w:firstLine="1575"/>
+            </w:pPr>
+            <w:r>
+              <w:t>"IP"</w:t>
+            </w:r>
+            <w:r>
+              <w:t xml:space="preserve">: </w:t>
+            </w:r>
+            <w:r>
+              <w:t>"127.0.0.1"</w:t>
+            </w:r>
+          </w:p>
+          <w:p>
+            <w:pPr>
+              <w:ind w:left="0" w:firstLineChars="600" w:firstLine="1260"/>
+            </w:pPr>
+            <w:r>
+              <w:t>},</w:t>
+            </w:r>
+          </w:p>
+          <w:p>
+            <w:pPr>
+              <w:ind w:left="0" w:firstLineChars="600" w:firstLine="1260"/>
+            </w:pPr>
+            <w:r>
+              <w:t>{</w:t>
+            </w:r>
+          </w:p>
+          <w:p>
+            <w:pPr>
+              <w:ind w:left="0" w:firstLineChars="750" w:firstLine="1575"/>
+            </w:pPr>
+            <w:r>
+              <w:t>"Name"</w:t>
+            </w:r>
+            <w:r>
+              <w:t xml:space="preserve">: </w:t>
+            </w:r>
+            <w:r>
+              <w:t>"eth0",</w:t>
+            </w:r>
+          </w:p>
+          <w:p>
+            <w:pPr>
+              <w:ind w:left="0" w:firstLineChars="750" w:firstLine="1575"/>
+            </w:pPr>
+            <w:r>
+              <w:t>"Model"</w:t>
+            </w:r>
+            <w:r>
+              <w:t xml:space="preserve">: </w:t>
+            </w:r>
+            <w:r>
+              <w:t>"",</w:t>
+            </w:r>
+          </w:p>
+          <w:p>
+            <w:pPr>
+              <w:ind w:left="0" w:firstLineChars="750" w:firstLine="1575"/>
+            </w:pPr>
+            <w:r>
+              <w:t>"Bandwidth"</w:t>
+            </w:r>
+            <w:r>
+              <w:t xml:space="preserve">: </w:t>
+            </w:r>
+            <w:r>
+              <w:t>"",</w:t>
+            </w:r>
+          </w:p>
+          <w:p>
+            <w:pPr>
+              <w:ind w:left="0" w:firstLineChars="750" w:firstLine="1575"/>
+            </w:pPr>
+            <w:r>
+              <w:t>"IP"</w:t>
+            </w:r>
+            <w:r>
+              <w:t xml:space="preserve">: </w:t>
+            </w:r>
+            <w:r>
+              <w:t>"192.168.1.213"</w:t>
+            </w:r>
+          </w:p>
+          <w:p>
+            <w:pPr>
+              <w:ind w:leftChars="170" w:firstLineChars="450" w:firstLine="945"/>
+            </w:pPr>
+            <w:r>
+              <w:t>}</w:t>
+            </w:r>
+          </w:p>
+          <w:p>
+            <w:pPr>
+              <w:ind w:leftChars="170" w:firstLineChars="300" w:firstLine="630"/>
+            </w:pPr>
+            <w:r>
+              <w:t>],</w:t>
+            </w:r>
+          </w:p>
+          <w:p>
+            <w:pPr>
+              <w:ind w:leftChars="170" w:firstLineChars="300" w:firstLine="630"/>
+            </w:pPr>
+            <w:r>
+              <w:t>"Port"</w:t>
+            </w:r>
+            <w:r>
+              <w:t xml:space="preserve">: </w:t>
+            </w:r>
+          </w:p>
+          <w:p>
+            <w:pPr>
+              <w:ind w:leftChars="170" w:firstLineChars="300" w:firstLine="630"/>
+            </w:pPr>
+            <w:r>
+              <w:t>[</w:t>
+            </w:r>
+          </w:p>
+          <w:p>
+            <w:pPr>
+              <w:ind w:leftChars="170" w:firstLineChars="450" w:firstLine="945"/>
+            </w:pPr>
+            <w:r>
+              <w:t>{</w:t>
+            </w:r>
+          </w:p>
+          <w:p>
+            <w:pPr>
+              <w:ind w:leftChars="170" w:firstLineChars="600" w:firstLine="1260"/>
+            </w:pPr>
+            <w:r>
+              <w:t>"Port"</w:t>
+            </w:r>
+            <w:r>
+              <w:t xml:space="preserve">: </w:t>
+            </w:r>
+            <w:r>
+              <w:t>"50000",</w:t>
+            </w:r>
+          </w:p>
+          <w:p>
+            <w:pPr>
+              <w:ind w:leftChars="170" w:firstLineChars="600" w:firstLine="1260"/>
+            </w:pPr>
+            <w:r>
+              <w:t>"Status"</w:t>
+            </w:r>
+            <w:r>
+              <w:t xml:space="preserve">: </w:t>
+            </w:r>
+            <w:r>
+              <w:t>false</w:t>
+            </w:r>
+          </w:p>
+          <w:p>
+            <w:pPr>
+              <w:ind w:leftChars="170" w:firstLineChars="450" w:firstLine="945"/>
+            </w:pPr>
+            <w:r>
+              <w:t>}</w:t>
+            </w:r>
+          </w:p>
+          <w:p>
+            <w:pPr>
+              <w:ind w:leftChars="170" w:firstLineChars="300" w:firstLine="630"/>
+            </w:pPr>
+            <w:r>
+              <w:t>],</w:t>
+            </w:r>
+          </w:p>
+          <w:p>
+            <w:pPr>
+              <w:ind w:leftChars="170" w:firstLineChars="300" w:firstLine="630"/>
+            </w:pPr>
+            <w:r>
+              <w:t>"Service"</w:t>
+            </w:r>
+            <w:r>
+              <w:t xml:space="preserve">: </w:t>
+            </w:r>
+          </w:p>
+          <w:p>
+            <w:pPr>
+              <w:ind w:leftChars="170" w:firstLineChars="300" w:firstLine="630"/>
+            </w:pPr>
+            <w:r>
+              <w:t>[</w:t>
+            </w:r>
+          </w:p>
+          <w:p>
+            <w:pPr>
+              <w:ind w:leftChars="170" w:firstLineChars="450" w:firstLine="945"/>
+            </w:pPr>
+            <w:r>
+              <w:t>{</w:t>
+            </w:r>
+          </w:p>
+          <w:p>
+            <w:pPr>
+              <w:ind w:leftChars="170" w:firstLineChars="600" w:firstLine="1260"/>
+            </w:pPr>
+            <w:r>
+              <w:t>"Name"</w:t>
+            </w:r>
+            <w:r>
+              <w:t xml:space="preserve">: </w:t>
+            </w:r>
+            <w:r>
+              <w:t>"",</w:t>
+            </w:r>
+          </w:p>
+          <w:p>
+            <w:pPr>
+              <w:ind w:leftChars="170" w:firstLineChars="600" w:firstLine="1260"/>
+            </w:pPr>
+            <w:r>
+              <w:t>"Status"</w:t>
+            </w:r>
+            <w:r>
+              <w:t xml:space="preserve">: </w:t>
+            </w:r>
+            <w:r>
+              <w:t>false,</w:t>
+            </w:r>
+          </w:p>
+          <w:p>
+            <w:pPr>
+              <w:ind w:leftChars="170" w:firstLineChars="600" w:firstLine="1260"/>
+            </w:pPr>
+            <w:r>
+              <w:t>"Version"</w:t>
+            </w:r>
+            <w:r>
+              <w:t xml:space="preserve">: </w:t>
+            </w:r>
+            <w:r>
+              <w:t>""</w:t>
+            </w:r>
+          </w:p>
+          <w:p>
+            <w:pPr>
+              <w:ind w:leftChars="170" w:firstLineChars="450" w:firstLine="945"/>
+            </w:pPr>
+            <w:r>
+              <w:t>}</w:t>
+            </w:r>
+          </w:p>
+          <w:p>
+            <w:pPr>
+              <w:ind w:leftChars="170" w:firstLineChars="300" w:firstLine="630"/>
+            </w:pPr>
+            <w:r>
+              <w:t>],</w:t>
+            </w:r>
+          </w:p>
+          <w:p>
+            <w:pPr>
+              <w:ind w:leftChars="170" w:firstLineChars="300" w:firstLine="630"/>
+            </w:pPr>
+            <w:r>
+              <w:t>"OM"</w:t>
+            </w:r>
+            <w:r>
+              <w:t xml:space="preserve">: </w:t>
+            </w:r>
+          </w:p>
+          <w:p>
+            <w:pPr>
+              <w:ind w:leftChars="170" w:firstLineChars="300" w:firstLine="630"/>
+            </w:pPr>
+            <w:r>
+              <w:t>{</w:t>
+            </w:r>
+          </w:p>
+          <w:p>
+            <w:pPr>
+              <w:ind w:leftChars="170" w:firstLineChars="450" w:firstLine="945"/>
+            </w:pPr>
+            <w:r>
+              <w:t>"Status"</w:t>
+            </w:r>
+            <w:r>
+              <w:t xml:space="preserve">: </w:t>
+            </w:r>
+            <w:r>
+              <w:t>false,</w:t>
+            </w:r>
+          </w:p>
+          <w:p>
+            <w:pPr>
+              <w:ind w:leftChars="170" w:firstLineChars="450" w:firstLine="945"/>
+            </w:pPr>
+            <w:r>
+              <w:t>"Version"</w:t>
+            </w:r>
+            <w:r>
+              <w:t xml:space="preserve">: </w:t>
+            </w:r>
+            <w:r>
+              <w:t>""</w:t>
+            </w:r>
+          </w:p>
+          <w:p>
+            <w:pPr>
+              <w:ind w:leftChars="170" w:firstLineChars="300" w:firstLine="630"/>
+            </w:pPr>
+            <w:r>
+              <w:t>},</w:t>
+            </w:r>
+          </w:p>
+          <w:p>
+            <w:pPr>
+              <w:ind w:leftChars="170" w:firstLineChars="300" w:firstLine="630"/>
+            </w:pPr>
+            <w:r>
+              <w:t>"Safety"</w:t>
+            </w:r>
+            <w:r>
+              <w:t xml:space="preserve">: </w:t>
+            </w:r>
+          </w:p>
+          <w:p>
+            <w:pPr>
+              <w:ind w:leftChars="170" w:firstLineChars="300" w:firstLine="630"/>
+            </w:pPr>
+            <w:r>
+              <w:t>{</w:t>
+            </w:r>
+          </w:p>
+          <w:p>
+            <w:pPr>
+              <w:ind w:leftChars="170" w:firstLineChars="450" w:firstLine="945"/>
+            </w:pPr>
+            <w:r>
+              <w:t>"Name"</w:t>
+            </w:r>
+            <w:r>
+              <w:t xml:space="preserve">: </w:t>
+            </w:r>
+            <w:r>
+              <w:t>"",</w:t>
+            </w:r>
+          </w:p>
+          <w:p>
+            <w:pPr>
+              <w:ind w:leftChars="170" w:firstLineChars="450" w:firstLine="945"/>
+            </w:pPr>
+            <w:r>
+              <w:t>"Context"</w:t>
+            </w:r>
+            <w:r>
+              <w:t xml:space="preserve">: </w:t>
+            </w:r>
+            <w:r>
+              <w:t>"",</w:t>
+            </w:r>
+          </w:p>
+          <w:p>
+            <w:pPr>
+              <w:ind w:leftChars="170" w:firstLineChars="450" w:firstLine="945"/>
+            </w:pPr>
+            <w:r>
+              <w:t>"Status"</w:t>
+            </w:r>
+            <w:r>
+              <w:t xml:space="preserve">: </w:t>
+            </w:r>
+            <w:r>
+              <w:t>false</w:t>
+            </w:r>
+          </w:p>
+          <w:p>
+            <w:pPr>
+              <w:ind w:leftChars="170" w:firstLineChars="300" w:firstLine="630"/>
             </w:pPr>
             <w:r>
               <w:lastRenderedPageBreak/>
@@ -10765,26 +11260,18 @@
           </w:p>
           <w:p>
             <w:pPr>
-              <w:ind w:left="0" w:firstLineChars="450" w:firstLine="945"/>
-            </w:pPr>
-            <w:r>
-              <w:t>"Net"</w:t>
-            </w:r>
-            <w:r>
-              <w:t xml:space="preserve">: </w:t>
-            </w:r>
-          </w:p>
-          <w:p>
-            <w:pPr>
-              <w:ind w:left="0" w:firstLineChars="450" w:firstLine="945"/>
-            </w:pPr>
-            <w:r>
-              <w:t>[</w:t>
-            </w:r>
-          </w:p>
-          <w:p>
-            <w:pPr>
-              <w:ind w:left="0" w:firstLineChars="600" w:firstLine="1260"/>
+              <w:ind w:leftChars="170" w:firstLineChars="300" w:firstLine="630"/>
+            </w:pPr>
+            <w:r>
+              <w:t>"OS"</w:t>
+            </w:r>
+            <w:r>
+              <w:t xml:space="preserve">: </w:t>
+            </w:r>
+          </w:p>
+          <w:p>
+            <w:pPr>
+              <w:ind w:leftChars="170" w:firstLineChars="300" w:firstLine="630"/>
             </w:pPr>
             <w:r>
               <w:t>{</w:t>
@@ -10792,453 +11279,9 @@
           </w:p>
           <w:p>
             <w:pPr>
-              <w:ind w:left="0" w:firstLineChars="750" w:firstLine="1575"/>
-            </w:pPr>
-            <w:r>
-              <w:t>"Name"</w:t>
-            </w:r>
-            <w:r>
-              <w:t xml:space="preserve">: </w:t>
-            </w:r>
-            <w:r>
-              <w:t>"lo",</w:t>
-            </w:r>
-          </w:p>
-          <w:p>
-            <w:pPr>
-              <w:ind w:left="0" w:firstLineChars="750" w:firstLine="1575"/>
-            </w:pPr>
-            <w:r>
-              <w:t>"Model"</w:t>
-            </w:r>
-            <w:r>
-              <w:t xml:space="preserve">: </w:t>
-            </w:r>
-            <w:r>
-              <w:t>"",</w:t>
-            </w:r>
-          </w:p>
-          <w:p>
-            <w:pPr>
-              <w:ind w:left="0" w:firstLineChars="750" w:firstLine="1575"/>
-            </w:pPr>
-            <w:r>
-              <w:t>"Bandwidth"</w:t>
-            </w:r>
-            <w:r>
-              <w:t xml:space="preserve">: </w:t>
-            </w:r>
-            <w:r>
-              <w:t>"",</w:t>
-            </w:r>
-          </w:p>
-          <w:p>
-            <w:pPr>
-              <w:ind w:left="0" w:firstLineChars="750" w:firstLine="1575"/>
-            </w:pPr>
-            <w:r>
-              <w:t>"IP"</w:t>
-            </w:r>
-            <w:r>
-              <w:t xml:space="preserve">: </w:t>
-            </w:r>
-            <w:r>
-              <w:t>"127.0.0.1"</w:t>
-            </w:r>
-          </w:p>
-          <w:p>
-            <w:pPr>
-              <w:ind w:left="0" w:firstLineChars="600" w:firstLine="1260"/>
-            </w:pPr>
-            <w:r>
-              <w:t>},</w:t>
-            </w:r>
-          </w:p>
-          <w:p>
-            <w:pPr>
-              <w:ind w:left="0" w:firstLineChars="600" w:firstLine="1260"/>
-            </w:pPr>
-            <w:r>
-              <w:t>{</w:t>
-            </w:r>
-          </w:p>
-          <w:p>
-            <w:pPr>
-              <w:ind w:left="0" w:firstLineChars="750" w:firstLine="1575"/>
-            </w:pPr>
-            <w:r>
-              <w:t>"Name"</w:t>
-            </w:r>
-            <w:r>
-              <w:t xml:space="preserve">: </w:t>
-            </w:r>
-            <w:r>
-              <w:t>"eth0",</w:t>
-            </w:r>
-          </w:p>
-          <w:p>
-            <w:pPr>
-              <w:ind w:left="0" w:firstLineChars="750" w:firstLine="1575"/>
-            </w:pPr>
-            <w:r>
-              <w:t>"Model"</w:t>
-            </w:r>
-            <w:r>
-              <w:t xml:space="preserve">: </w:t>
-            </w:r>
-            <w:r>
-              <w:t>"",</w:t>
-            </w:r>
-          </w:p>
-          <w:p>
-            <w:pPr>
-              <w:ind w:left="0" w:firstLineChars="750" w:firstLine="1575"/>
-            </w:pPr>
-            <w:r>
-              <w:t>"Bandwidth"</w:t>
-            </w:r>
-            <w:r>
-              <w:t xml:space="preserve">: </w:t>
-            </w:r>
-            <w:r>
-              <w:t>"",</w:t>
-            </w:r>
-          </w:p>
-          <w:p>
-            <w:pPr>
-              <w:ind w:left="0" w:firstLineChars="750" w:firstLine="1575"/>
-            </w:pPr>
-            <w:r>
-              <w:t>"IP"</w:t>
-            </w:r>
-            <w:r>
-              <w:t xml:space="preserve">: </w:t>
-            </w:r>
-            <w:r>
-              <w:t>"192.168.1.213"</w:t>
-            </w:r>
-          </w:p>
-          <w:p>
-            <w:pPr>
               <w:ind w:leftChars="170" w:firstLineChars="450" w:firstLine="945"/>
             </w:pPr>
             <w:r>
-              <w:t>}</w:t>
-            </w:r>
-          </w:p>
-          <w:p>
-            <w:pPr>
-              <w:ind w:leftChars="170" w:firstLineChars="300" w:firstLine="630"/>
-            </w:pPr>
-            <w:r>
-              <w:t>],</w:t>
-            </w:r>
-          </w:p>
-          <w:p>
-            <w:pPr>
-              <w:ind w:leftChars="170" w:firstLineChars="300" w:firstLine="630"/>
-            </w:pPr>
-            <w:r>
-              <w:t>"Port"</w:t>
-            </w:r>
-            <w:r>
-              <w:t xml:space="preserve">: </w:t>
-            </w:r>
-          </w:p>
-          <w:p>
-            <w:pPr>
-              <w:ind w:leftChars="170" w:firstLineChars="300" w:firstLine="630"/>
-            </w:pPr>
-            <w:r>
-              <w:t>[</w:t>
-            </w:r>
-          </w:p>
-          <w:p>
-            <w:pPr>
-              <w:ind w:leftChars="170" w:firstLineChars="450" w:firstLine="945"/>
-            </w:pPr>
-            <w:r>
-              <w:t>{</w:t>
-            </w:r>
-          </w:p>
-          <w:p>
-            <w:pPr>
-              <w:ind w:leftChars="170" w:firstLineChars="600" w:firstLine="1260"/>
-            </w:pPr>
-            <w:r>
-              <w:t>"Port"</w:t>
-            </w:r>
-            <w:r>
-              <w:t xml:space="preserve">: </w:t>
-            </w:r>
-            <w:r>
-              <w:t>"50000",</w:t>
-            </w:r>
-          </w:p>
-          <w:p>
-            <w:pPr>
-              <w:ind w:leftChars="170" w:firstLineChars="600" w:firstLine="1260"/>
-            </w:pPr>
-            <w:r>
-              <w:t>"Status"</w:t>
-            </w:r>
-            <w:r>
-              <w:t xml:space="preserve">: </w:t>
-            </w:r>
-            <w:r>
-              <w:t>false</w:t>
-            </w:r>
-          </w:p>
-          <w:p>
-            <w:pPr>
-              <w:ind w:leftChars="170" w:firstLineChars="450" w:firstLine="945"/>
-            </w:pPr>
-            <w:r>
-              <w:t>}</w:t>
-            </w:r>
-          </w:p>
-          <w:p>
-            <w:pPr>
-              <w:ind w:leftChars="170" w:firstLineChars="300" w:firstLine="630"/>
-            </w:pPr>
-            <w:r>
-              <w:t>],</w:t>
-            </w:r>
-          </w:p>
-          <w:p>
-            <w:pPr>
-              <w:ind w:leftChars="170" w:firstLineChars="300" w:firstLine="630"/>
-            </w:pPr>
-            <w:r>
-              <w:t>"Service"</w:t>
-            </w:r>
-            <w:r>
-              <w:t xml:space="preserve">: </w:t>
-            </w:r>
-          </w:p>
-          <w:p>
-            <w:pPr>
-              <w:ind w:leftChars="170" w:firstLineChars="300" w:firstLine="630"/>
-            </w:pPr>
-            <w:r>
-              <w:t>[</w:t>
-            </w:r>
-          </w:p>
-          <w:p>
-            <w:pPr>
-              <w:ind w:leftChars="170" w:firstLineChars="450" w:firstLine="945"/>
-            </w:pPr>
-            <w:r>
-              <w:t>{</w:t>
-            </w:r>
-          </w:p>
-          <w:p>
-            <w:pPr>
-              <w:ind w:leftChars="170" w:firstLineChars="600" w:firstLine="1260"/>
-            </w:pPr>
-            <w:r>
-              <w:t>"Name"</w:t>
-            </w:r>
-            <w:r>
-              <w:t xml:space="preserve">: </w:t>
-            </w:r>
-            <w:r>
-              <w:t>"",</w:t>
-            </w:r>
-          </w:p>
-          <w:p>
-            <w:pPr>
-              <w:ind w:leftChars="170" w:firstLineChars="600" w:firstLine="1260"/>
-            </w:pPr>
-            <w:r>
-              <w:t>"Status"</w:t>
-            </w:r>
-            <w:r>
-              <w:t xml:space="preserve">: </w:t>
-            </w:r>
-            <w:r>
-              <w:t>false,</w:t>
-            </w:r>
-          </w:p>
-          <w:p>
-            <w:pPr>
-              <w:ind w:leftChars="170" w:firstLineChars="600" w:firstLine="1260"/>
-            </w:pPr>
-            <w:r>
-              <w:t>"Version"</w:t>
-            </w:r>
-            <w:r>
-              <w:t xml:space="preserve">: </w:t>
-            </w:r>
-            <w:r>
-              <w:t>""</w:t>
-            </w:r>
-          </w:p>
-          <w:p>
-            <w:pPr>
-              <w:ind w:leftChars="170" w:firstLineChars="450" w:firstLine="945"/>
-            </w:pPr>
-            <w:r>
-              <w:t>}</w:t>
-            </w:r>
-          </w:p>
-          <w:p>
-            <w:pPr>
-              <w:ind w:leftChars="170" w:firstLineChars="300" w:firstLine="630"/>
-            </w:pPr>
-            <w:r>
-              <w:t>],</w:t>
-            </w:r>
-          </w:p>
-          <w:p>
-            <w:pPr>
-              <w:ind w:leftChars="170" w:firstLineChars="300" w:firstLine="630"/>
-            </w:pPr>
-            <w:r>
-              <w:t>"OM"</w:t>
-            </w:r>
-            <w:r>
-              <w:t xml:space="preserve">: </w:t>
-            </w:r>
-          </w:p>
-          <w:p>
-            <w:pPr>
-              <w:ind w:leftChars="170" w:firstLineChars="300" w:firstLine="630"/>
-            </w:pPr>
-            <w:r>
-              <w:t>{</w:t>
-            </w:r>
-          </w:p>
-          <w:p>
-            <w:pPr>
-              <w:ind w:leftChars="170" w:firstLineChars="450" w:firstLine="945"/>
-            </w:pPr>
-            <w:r>
-              <w:t>"Status"</w:t>
-            </w:r>
-            <w:r>
-              <w:t xml:space="preserve">: </w:t>
-            </w:r>
-            <w:r>
-              <w:t>false,</w:t>
-            </w:r>
-          </w:p>
-          <w:p>
-            <w:pPr>
-              <w:ind w:leftChars="170" w:firstLineChars="450" w:firstLine="945"/>
-            </w:pPr>
-            <w:r>
-              <w:t>"Version"</w:t>
-            </w:r>
-            <w:r>
-              <w:t xml:space="preserve">: </w:t>
-            </w:r>
-            <w:r>
-              <w:t>""</w:t>
-            </w:r>
-          </w:p>
-          <w:p>
-            <w:pPr>
-              <w:ind w:leftChars="170" w:firstLineChars="300" w:firstLine="630"/>
-            </w:pPr>
-            <w:r>
-              <w:t>},</w:t>
-            </w:r>
-          </w:p>
-          <w:p>
-            <w:pPr>
-              <w:ind w:leftChars="170" w:firstLineChars="300" w:firstLine="630"/>
-            </w:pPr>
-            <w:r>
-              <w:t>"Safety"</w:t>
-            </w:r>
-            <w:r>
-              <w:t xml:space="preserve">: </w:t>
-            </w:r>
-          </w:p>
-          <w:p>
-            <w:pPr>
-              <w:ind w:leftChars="170" w:firstLineChars="300" w:firstLine="630"/>
-            </w:pPr>
-            <w:r>
-              <w:t>{</w:t>
-            </w:r>
-          </w:p>
-          <w:p>
-            <w:pPr>
-              <w:ind w:leftChars="170" w:firstLineChars="450" w:firstLine="945"/>
-            </w:pPr>
-            <w:r>
-              <w:t>"Name"</w:t>
-            </w:r>
-            <w:r>
-              <w:t xml:space="preserve">: </w:t>
-            </w:r>
-            <w:r>
-              <w:t>"",</w:t>
-            </w:r>
-          </w:p>
-          <w:p>
-            <w:pPr>
-              <w:ind w:leftChars="170" w:firstLineChars="450" w:firstLine="945"/>
-            </w:pPr>
-            <w:r>
-              <w:t>"Context"</w:t>
-            </w:r>
-            <w:r>
-              <w:t xml:space="preserve">: </w:t>
-            </w:r>
-            <w:r>
-              <w:t>"",</w:t>
-            </w:r>
-          </w:p>
-          <w:p>
-            <w:pPr>
-              <w:ind w:leftChars="170" w:firstLineChars="450" w:firstLine="945"/>
-            </w:pPr>
-            <w:r>
-              <w:t>"Status"</w:t>
-            </w:r>
-            <w:r>
-              <w:t xml:space="preserve">: </w:t>
-            </w:r>
-            <w:r>
-              <w:t>false</w:t>
-            </w:r>
-          </w:p>
-          <w:p>
-            <w:pPr>
-              <w:ind w:leftChars="170" w:firstLineChars="300" w:firstLine="630"/>
-            </w:pPr>
-            <w:r>
-              <w:t>},</w:t>
-            </w:r>
-          </w:p>
-          <w:p>
-            <w:pPr>
-              <w:ind w:leftChars="170" w:firstLineChars="300" w:firstLine="630"/>
-            </w:pPr>
-            <w:r>
-              <w:t>"OS"</w:t>
-            </w:r>
-            <w:r>
-              <w:t xml:space="preserve">: </w:t>
-            </w:r>
-          </w:p>
-          <w:p>
-            <w:pPr>
-              <w:ind w:leftChars="170" w:firstLineChars="300" w:firstLine="630"/>
-            </w:pPr>
-            <w:r>
-              <w:t>{</w:t>
-            </w:r>
-          </w:p>
-          <w:p>
-            <w:pPr>
-              <w:ind w:leftChars="170" w:firstLineChars="450" w:firstLine="945"/>
-            </w:pPr>
-            <w:r>
-              <w:lastRenderedPageBreak/>
               <w:t>"Distributor"</w:t>
             </w:r>
             <w:r>
@@ -12046,6 +12089,7 @@
               <w:rPr>
                 <w:rFonts w:hint="eastAsia"/>
               </w:rPr>
+              <w:lastRenderedPageBreak/>
               <w:t>读取</w:t>
             </w:r>
             <w:r>
@@ -12098,14 +12142,7 @@
               <w:rPr>
                 <w:rFonts w:hint="eastAsia"/>
               </w:rPr>
-              <w:t>，并删</w:t>
-            </w:r>
-            <w:r>
-              <w:rPr>
-                <w:rFonts w:hint="eastAsia"/>
-              </w:rPr>
-              <w:lastRenderedPageBreak/>
-              <w:t>除</w:t>
+              <w:t>，并删除</w:t>
             </w:r>
             <w:r>
               <w:rPr>
@@ -13048,6 +13085,7 @@
               <w:rPr>
                 <w:rFonts w:hint="eastAsia"/>
               </w:rPr>
+              <w:lastRenderedPageBreak/>
               <w:t>请求头</w:t>
             </w:r>
           </w:p>
@@ -13098,7 +13136,6 @@
               <w:rPr>
                 <w:rFonts w:hint="eastAsia"/>
               </w:rPr>
-              <w:lastRenderedPageBreak/>
               <w:t>请求内容</w:t>
             </w:r>
           </w:p>
@@ -13178,6 +13215,46 @@
                 <w:rFonts w:hint="eastAsia"/>
               </w:rPr>
               <w:t>hinter: object</w:t>
+            </w:r>
+          </w:p>
+          <w:p>
+            <w:pPr>
+              <w:ind w:left="0"/>
+            </w:pPr>
+            <w:r>
+              <w:rPr>
+                <w:rFonts w:hint="eastAsia"/>
+              </w:rPr>
+              <w:t>skip:</w:t>
+            </w:r>
+            <w:r>
+              <w:rPr>
+                <w:rFonts w:hint="eastAsia"/>
+              </w:rPr>
+              <w:t>跳过记录数</w:t>
+            </w:r>
+          </w:p>
+          <w:p>
+            <w:pPr>
+              <w:ind w:left="0"/>
+            </w:pPr>
+            <w:r>
+              <w:rPr>
+                <w:rFonts w:hint="eastAsia"/>
+              </w:rPr>
+              <w:t>limit</w:t>
+            </w:r>
+            <w:r>
+              <w:rPr>
+                <w:rFonts w:hint="eastAsia"/>
+              </w:rPr>
+              <w:t>:</w:t>
+            </w:r>
+            <w:r>
+              <w:rPr>
+                <w:rFonts w:hint="eastAsia"/>
+              </w:rPr>
+              <w:t>查询记录数</w:t>
             </w:r>
           </w:p>
         </w:tc>
@@ -14126,6 +14203,7 @@
               <w:ind w:left="0" w:firstLineChars="150" w:firstLine="315"/>
             </w:pPr>
             <w:r>
+              <w:lastRenderedPageBreak/>
               <w:t xml:space="preserve">   },</w:t>
             </w:r>
           </w:p>
@@ -14150,8 +14228,331 @@
               <w:ind w:left="0" w:firstLineChars="150" w:firstLine="315"/>
             </w:pPr>
             <w:r>
+              <w:t xml:space="preserve">      "Model": "",</w:t>
+            </w:r>
+          </w:p>
+          <w:p>
+            <w:pPr>
+              <w:ind w:left="0" w:firstLineChars="150" w:firstLine="315"/>
+            </w:pPr>
+            <w:r>
+              <w:t xml:space="preserve">      "Bandwidth": "",</w:t>
+            </w:r>
+          </w:p>
+          <w:p>
+            <w:pPr>
+              <w:ind w:left="0" w:firstLineChars="150" w:firstLine="315"/>
+            </w:pPr>
+            <w:r>
+              <w:t xml:space="preserve">      "IP": "192.168.1.213"</w:t>
+            </w:r>
+          </w:p>
+          <w:p>
+            <w:pPr>
+              <w:ind w:left="0" w:firstLineChars="150" w:firstLine="315"/>
+            </w:pPr>
+            <w:r>
+              <w:t xml:space="preserve">   }</w:t>
+            </w:r>
+          </w:p>
+          <w:p>
+            <w:pPr>
+              <w:ind w:left="0" w:firstLineChars="150" w:firstLine="315"/>
+            </w:pPr>
+            <w:r>
+              <w:t>],</w:t>
+            </w:r>
+          </w:p>
+          <w:p>
+            <w:pPr>
+              <w:ind w:left="0" w:firstLineChars="150" w:firstLine="315"/>
+            </w:pPr>
+            <w:r>
+              <w:t xml:space="preserve">"Port": </w:t>
+            </w:r>
+          </w:p>
+          <w:p>
+            <w:pPr>
+              <w:ind w:left="0" w:firstLineChars="150" w:firstLine="315"/>
+            </w:pPr>
+            <w:r>
+              <w:t>[</w:t>
+            </w:r>
+          </w:p>
+          <w:p>
+            <w:pPr>
+              <w:ind w:left="0" w:firstLineChars="150" w:firstLine="315"/>
+            </w:pPr>
+            <w:r>
+              <w:t xml:space="preserve">   {</w:t>
+            </w:r>
+          </w:p>
+          <w:p>
+            <w:pPr>
+              <w:ind w:left="0" w:firstLineChars="150" w:firstLine="315"/>
+            </w:pPr>
+            <w:r>
+              <w:t xml:space="preserve">      "Port": "50000",</w:t>
+            </w:r>
+          </w:p>
+          <w:p>
+            <w:pPr>
+              <w:ind w:left="0" w:firstLineChars="150" w:firstLine="315"/>
+            </w:pPr>
+            <w:r>
+              <w:t xml:space="preserve">      "Status": false</w:t>
+            </w:r>
+          </w:p>
+          <w:p>
+            <w:pPr>
+              <w:ind w:left="0" w:firstLineChars="150" w:firstLine="315"/>
+            </w:pPr>
+            <w:r>
+              <w:t xml:space="preserve">   }</w:t>
+            </w:r>
+          </w:p>
+          <w:p>
+            <w:pPr>
+              <w:ind w:left="0" w:firstLineChars="150" w:firstLine="315"/>
+            </w:pPr>
+            <w:r>
+              <w:t>],</w:t>
+            </w:r>
+          </w:p>
+          <w:p>
+            <w:pPr>
+              <w:ind w:left="0" w:firstLineChars="150" w:firstLine="315"/>
+            </w:pPr>
+            <w:r>
+              <w:t xml:space="preserve">"Service": </w:t>
+            </w:r>
+          </w:p>
+          <w:p>
+            <w:pPr>
+              <w:ind w:left="0" w:firstLineChars="150" w:firstLine="315"/>
+            </w:pPr>
+            <w:r>
+              <w:t>[</w:t>
+            </w:r>
+          </w:p>
+          <w:p>
+            <w:pPr>
+              <w:ind w:left="0" w:firstLineChars="150" w:firstLine="315"/>
+            </w:pPr>
+            <w:r>
+              <w:t xml:space="preserve">   {</w:t>
+            </w:r>
+          </w:p>
+          <w:p>
+            <w:pPr>
+              <w:ind w:left="0" w:firstLineChars="150" w:firstLine="315"/>
+            </w:pPr>
+            <w:r>
+              <w:t xml:space="preserve">      "Name": "",</w:t>
+            </w:r>
+          </w:p>
+          <w:p>
+            <w:pPr>
+              <w:ind w:left="0" w:firstLineChars="150" w:firstLine="315"/>
+            </w:pPr>
+            <w:r>
+              <w:t xml:space="preserve">      "Status": false,</w:t>
+            </w:r>
+          </w:p>
+          <w:p>
+            <w:pPr>
+              <w:ind w:left="0" w:firstLineChars="150" w:firstLine="315"/>
+            </w:pPr>
+            <w:r>
+              <w:t xml:space="preserve">      "Version": ""</w:t>
+            </w:r>
+          </w:p>
+          <w:p>
+            <w:pPr>
+              <w:ind w:left="0" w:firstLineChars="150" w:firstLine="315"/>
+            </w:pPr>
+            <w:r>
+              <w:t xml:space="preserve">   }</w:t>
+            </w:r>
+          </w:p>
+          <w:p>
+            <w:pPr>
+              <w:ind w:left="0" w:firstLineChars="150" w:firstLine="315"/>
+            </w:pPr>
+            <w:r>
+              <w:t>],</w:t>
+            </w:r>
+          </w:p>
+          <w:p>
+            <w:pPr>
+              <w:ind w:left="0" w:firstLineChars="150" w:firstLine="315"/>
+            </w:pPr>
+            <w:r>
+              <w:t xml:space="preserve">"OM": </w:t>
+            </w:r>
+          </w:p>
+          <w:p>
+            <w:pPr>
+              <w:ind w:left="0" w:firstLineChars="150" w:firstLine="315"/>
+            </w:pPr>
+            <w:r>
+              <w:t>{</w:t>
+            </w:r>
+          </w:p>
+          <w:p>
+            <w:pPr>
+              <w:ind w:left="0" w:firstLineChars="150" w:firstLine="315"/>
+            </w:pPr>
+            <w:r>
+              <w:t xml:space="preserve">   "Status": false,</w:t>
+            </w:r>
+          </w:p>
+          <w:p>
+            <w:pPr>
+              <w:ind w:left="0" w:firstLineChars="150" w:firstLine="315"/>
+            </w:pPr>
+            <w:r>
+              <w:t xml:space="preserve">   "Version": ""</w:t>
+            </w:r>
+          </w:p>
+          <w:p>
+            <w:pPr>
+              <w:ind w:left="0" w:firstLineChars="150" w:firstLine="315"/>
+            </w:pPr>
+            <w:r>
+              <w:t>},</w:t>
+            </w:r>
+          </w:p>
+          <w:p>
+            <w:pPr>
+              <w:ind w:left="0" w:firstLineChars="150" w:firstLine="315"/>
+            </w:pPr>
+            <w:r>
+              <w:t xml:space="preserve">"Safety": </w:t>
+            </w:r>
+          </w:p>
+          <w:p>
+            <w:pPr>
+              <w:ind w:left="0" w:firstLineChars="150" w:firstLine="315"/>
+            </w:pPr>
+            <w:r>
+              <w:t>{</w:t>
+            </w:r>
+          </w:p>
+          <w:p>
+            <w:pPr>
+              <w:ind w:left="0" w:firstLineChars="150" w:firstLine="315"/>
+            </w:pPr>
+            <w:r>
+              <w:t xml:space="preserve">   "Name": "",</w:t>
+            </w:r>
+          </w:p>
+          <w:p>
+            <w:pPr>
+              <w:ind w:left="0" w:firstLineChars="150" w:firstLine="315"/>
+            </w:pPr>
+            <w:r>
+              <w:t xml:space="preserve">   "Context": "",</w:t>
+            </w:r>
+          </w:p>
+          <w:p>
+            <w:pPr>
+              <w:ind w:left="0" w:firstLineChars="150" w:firstLine="315"/>
+            </w:pPr>
+            <w:r>
+              <w:t xml:space="preserve">   "Status": false</w:t>
+            </w:r>
+          </w:p>
+          <w:p>
+            <w:pPr>
+              <w:ind w:left="0" w:firstLineChars="150" w:firstLine="315"/>
+            </w:pPr>
+            <w:r>
+              <w:t>},</w:t>
+            </w:r>
+          </w:p>
+          <w:p>
+            <w:pPr>
+              <w:ind w:left="0" w:firstLineChars="150" w:firstLine="315"/>
+            </w:pPr>
+            <w:r>
+              <w:t xml:space="preserve">"OS": </w:t>
+            </w:r>
+          </w:p>
+          <w:p>
+            <w:pPr>
+              <w:ind w:left="0" w:firstLineChars="150" w:firstLine="315"/>
+            </w:pPr>
+            <w:r>
+              <w:t>{</w:t>
+            </w:r>
+          </w:p>
+          <w:p>
+            <w:pPr>
+              <w:ind w:left="0" w:firstLineChars="150" w:firstLine="315"/>
+            </w:pPr>
+            <w:r>
+              <w:t xml:space="preserve">   "Distributor": "Ubuntu",</w:t>
+            </w:r>
+          </w:p>
+          <w:p>
+            <w:pPr>
+              <w:ind w:left="0" w:firstLineChars="150" w:firstLine="315"/>
+            </w:pPr>
+            <w:r>
+              <w:t xml:space="preserve">   "Release": "12.04",</w:t>
+            </w:r>
+          </w:p>
+          <w:p>
+            <w:pPr>
+              <w:ind w:left="0" w:firstLineChars="150" w:firstLine="315"/>
+            </w:pPr>
+            <w:r>
+              <w:t xml:space="preserve">   "Bit": 64</w:t>
+            </w:r>
+          </w:p>
+          <w:p>
+            <w:pPr>
+              <w:ind w:left="0" w:firstLineChars="150" w:firstLine="315"/>
+            </w:pPr>
+            <w:r>
+              <w:t>},</w:t>
+            </w:r>
+          </w:p>
+          <w:p>
+            <w:pPr>
+              <w:ind w:left="0" w:firstLineChars="150" w:firstLine="315"/>
+            </w:pPr>
+            <w:r>
+              <w:t xml:space="preserve">"Disk": </w:t>
+            </w:r>
+          </w:p>
+          <w:p>
+            <w:pPr>
+              <w:ind w:left="0" w:firstLineChars="150" w:firstLine="315"/>
+            </w:pPr>
+            <w:r>
+              <w:t>[</w:t>
+            </w:r>
+          </w:p>
+          <w:p>
+            <w:pPr>
+              <w:ind w:left="0" w:firstLineChars="150" w:firstLine="315"/>
+            </w:pPr>
+            <w:r>
+              <w:t xml:space="preserve">   {</w:t>
+            </w:r>
+          </w:p>
+          <w:p>
+            <w:pPr>
+              <w:ind w:left="0" w:firstLineChars="150" w:firstLine="315"/>
+            </w:pPr>
+            <w:r>
+              <w:t xml:space="preserve">      "Name": </w:t>
+            </w:r>
+            <w:r>
               <w:lastRenderedPageBreak/>
-              <w:t xml:space="preserve">      "Model": "",</w:t>
+              <w:t xml:space="preserve">"/dev/mapper/vgdata-lvdata1", </w:t>
             </w:r>
           </w:p>
           <w:p>
@@ -14159,7 +14560,7 @@
               <w:ind w:left="0" w:firstLineChars="150" w:firstLine="315"/>
             </w:pPr>
             <w:r>
-              <w:t xml:space="preserve">      "Bandwidth": "",</w:t>
+              <w:t xml:space="preserve">      "Mount": "/home/mount", </w:t>
             </w:r>
           </w:p>
           <w:p>
@@ -14167,7 +14568,7 @@
               <w:ind w:left="0" w:firstLineChars="150" w:firstLine="315"/>
             </w:pPr>
             <w:r>
-              <w:t xml:space="preserve">      "IP": "192.168.1.213"</w:t>
+              <w:t xml:space="preserve">      "Size": 32529, </w:t>
             </w:r>
           </w:p>
           <w:p>
@@ -14175,327 +14576,6 @@
               <w:ind w:left="0" w:firstLineChars="150" w:firstLine="315"/>
             </w:pPr>
             <w:r>
-              <w:t xml:space="preserve">   }</w:t>
-            </w:r>
-          </w:p>
-          <w:p>
-            <w:pPr>
-              <w:ind w:left="0" w:firstLineChars="150" w:firstLine="315"/>
-            </w:pPr>
-            <w:r>
-              <w:t>],</w:t>
-            </w:r>
-          </w:p>
-          <w:p>
-            <w:pPr>
-              <w:ind w:left="0" w:firstLineChars="150" w:firstLine="315"/>
-            </w:pPr>
-            <w:r>
-              <w:t xml:space="preserve">"Port": </w:t>
-            </w:r>
-          </w:p>
-          <w:p>
-            <w:pPr>
-              <w:ind w:left="0" w:firstLineChars="150" w:firstLine="315"/>
-            </w:pPr>
-            <w:r>
-              <w:t>[</w:t>
-            </w:r>
-          </w:p>
-          <w:p>
-            <w:pPr>
-              <w:ind w:left="0" w:firstLineChars="150" w:firstLine="315"/>
-            </w:pPr>
-            <w:r>
-              <w:t xml:space="preserve">   {</w:t>
-            </w:r>
-          </w:p>
-          <w:p>
-            <w:pPr>
-              <w:ind w:left="0" w:firstLineChars="150" w:firstLine="315"/>
-            </w:pPr>
-            <w:r>
-              <w:t xml:space="preserve">      "Port": "50000",</w:t>
-            </w:r>
-          </w:p>
-          <w:p>
-            <w:pPr>
-              <w:ind w:left="0" w:firstLineChars="150" w:firstLine="315"/>
-            </w:pPr>
-            <w:r>
-              <w:t xml:space="preserve">      "Status": false</w:t>
-            </w:r>
-          </w:p>
-          <w:p>
-            <w:pPr>
-              <w:ind w:left="0" w:firstLineChars="150" w:firstLine="315"/>
-            </w:pPr>
-            <w:r>
-              <w:t xml:space="preserve">   }</w:t>
-            </w:r>
-          </w:p>
-          <w:p>
-            <w:pPr>
-              <w:ind w:left="0" w:firstLineChars="150" w:firstLine="315"/>
-            </w:pPr>
-            <w:r>
-              <w:t>],</w:t>
-            </w:r>
-          </w:p>
-          <w:p>
-            <w:pPr>
-              <w:ind w:left="0" w:firstLineChars="150" w:firstLine="315"/>
-            </w:pPr>
-            <w:r>
-              <w:t xml:space="preserve">"Service": </w:t>
-            </w:r>
-          </w:p>
-          <w:p>
-            <w:pPr>
-              <w:ind w:left="0" w:firstLineChars="150" w:firstLine="315"/>
-            </w:pPr>
-            <w:r>
-              <w:t>[</w:t>
-            </w:r>
-          </w:p>
-          <w:p>
-            <w:pPr>
-              <w:ind w:left="0" w:firstLineChars="150" w:firstLine="315"/>
-            </w:pPr>
-            <w:r>
-              <w:t xml:space="preserve">   {</w:t>
-            </w:r>
-          </w:p>
-          <w:p>
-            <w:pPr>
-              <w:ind w:left="0" w:firstLineChars="150" w:firstLine="315"/>
-            </w:pPr>
-            <w:r>
-              <w:t xml:space="preserve">      "Name": "",</w:t>
-            </w:r>
-          </w:p>
-          <w:p>
-            <w:pPr>
-              <w:ind w:left="0" w:firstLineChars="150" w:firstLine="315"/>
-            </w:pPr>
-            <w:r>
-              <w:t xml:space="preserve">      "Status": false,</w:t>
-            </w:r>
-          </w:p>
-          <w:p>
-            <w:pPr>
-              <w:ind w:left="0" w:firstLineChars="150" w:firstLine="315"/>
-            </w:pPr>
-            <w:r>
-              <w:t xml:space="preserve">      "Version": ""</w:t>
-            </w:r>
-          </w:p>
-          <w:p>
-            <w:pPr>
-              <w:ind w:left="0" w:firstLineChars="150" w:firstLine="315"/>
-            </w:pPr>
-            <w:r>
-              <w:t xml:space="preserve">   }</w:t>
-            </w:r>
-          </w:p>
-          <w:p>
-            <w:pPr>
-              <w:ind w:left="0" w:firstLineChars="150" w:firstLine="315"/>
-            </w:pPr>
-            <w:r>
-              <w:t>],</w:t>
-            </w:r>
-          </w:p>
-          <w:p>
-            <w:pPr>
-              <w:ind w:left="0" w:firstLineChars="150" w:firstLine="315"/>
-            </w:pPr>
-            <w:r>
-              <w:t xml:space="preserve">"OM": </w:t>
-            </w:r>
-          </w:p>
-          <w:p>
-            <w:pPr>
-              <w:ind w:left="0" w:firstLineChars="150" w:firstLine="315"/>
-            </w:pPr>
-            <w:r>
-              <w:t>{</w:t>
-            </w:r>
-          </w:p>
-          <w:p>
-            <w:pPr>
-              <w:ind w:left="0" w:firstLineChars="150" w:firstLine="315"/>
-            </w:pPr>
-            <w:r>
-              <w:t xml:space="preserve">   "Status": false,</w:t>
-            </w:r>
-          </w:p>
-          <w:p>
-            <w:pPr>
-              <w:ind w:left="0" w:firstLineChars="150" w:firstLine="315"/>
-            </w:pPr>
-            <w:r>
-              <w:t xml:space="preserve">   "Version": ""</w:t>
-            </w:r>
-          </w:p>
-          <w:p>
-            <w:pPr>
-              <w:ind w:left="0" w:firstLineChars="150" w:firstLine="315"/>
-            </w:pPr>
-            <w:r>
-              <w:t>},</w:t>
-            </w:r>
-          </w:p>
-          <w:p>
-            <w:pPr>
-              <w:ind w:left="0" w:firstLineChars="150" w:firstLine="315"/>
-            </w:pPr>
-            <w:r>
-              <w:t xml:space="preserve">"Safety": </w:t>
-            </w:r>
-          </w:p>
-          <w:p>
-            <w:pPr>
-              <w:ind w:left="0" w:firstLineChars="150" w:firstLine="315"/>
-            </w:pPr>
-            <w:r>
-              <w:t>{</w:t>
-            </w:r>
-          </w:p>
-          <w:p>
-            <w:pPr>
-              <w:ind w:left="0" w:firstLineChars="150" w:firstLine="315"/>
-            </w:pPr>
-            <w:r>
-              <w:t xml:space="preserve">   "Name": "",</w:t>
-            </w:r>
-          </w:p>
-          <w:p>
-            <w:pPr>
-              <w:ind w:left="0" w:firstLineChars="150" w:firstLine="315"/>
-            </w:pPr>
-            <w:r>
-              <w:t xml:space="preserve">   "Context": "",</w:t>
-            </w:r>
-          </w:p>
-          <w:p>
-            <w:pPr>
-              <w:ind w:left="0" w:firstLineChars="150" w:firstLine="315"/>
-            </w:pPr>
-            <w:r>
-              <w:t xml:space="preserve">   "Status": false</w:t>
-            </w:r>
-          </w:p>
-          <w:p>
-            <w:pPr>
-              <w:ind w:left="0" w:firstLineChars="150" w:firstLine="315"/>
-            </w:pPr>
-            <w:r>
-              <w:t>},</w:t>
-            </w:r>
-          </w:p>
-          <w:p>
-            <w:pPr>
-              <w:ind w:left="0" w:firstLineChars="150" w:firstLine="315"/>
-            </w:pPr>
-            <w:r>
-              <w:t xml:space="preserve">"OS": </w:t>
-            </w:r>
-          </w:p>
-          <w:p>
-            <w:pPr>
-              <w:ind w:left="0" w:firstLineChars="150" w:firstLine="315"/>
-            </w:pPr>
-            <w:r>
-              <w:t>{</w:t>
-            </w:r>
-          </w:p>
-          <w:p>
-            <w:pPr>
-              <w:ind w:left="0" w:firstLineChars="150" w:firstLine="315"/>
-            </w:pPr>
-            <w:r>
-              <w:t xml:space="preserve">   "Distributor": "Ubuntu",</w:t>
-            </w:r>
-          </w:p>
-          <w:p>
-            <w:pPr>
-              <w:ind w:left="0" w:firstLineChars="150" w:firstLine="315"/>
-            </w:pPr>
-            <w:r>
-              <w:t xml:space="preserve">   "Release": "12.04",</w:t>
-            </w:r>
-          </w:p>
-          <w:p>
-            <w:pPr>
-              <w:ind w:left="0" w:firstLineChars="150" w:firstLine="315"/>
-            </w:pPr>
-            <w:r>
-              <w:t xml:space="preserve">   "Bit": 64</w:t>
-            </w:r>
-          </w:p>
-          <w:p>
-            <w:pPr>
-              <w:ind w:left="0" w:firstLineChars="150" w:firstLine="315"/>
-            </w:pPr>
-            <w:r>
-              <w:t>},</w:t>
-            </w:r>
-          </w:p>
-          <w:p>
-            <w:pPr>
-              <w:ind w:left="0" w:firstLineChars="150" w:firstLine="315"/>
-            </w:pPr>
-            <w:r>
-              <w:t xml:space="preserve">"Disk": </w:t>
-            </w:r>
-          </w:p>
-          <w:p>
-            <w:pPr>
-              <w:ind w:left="0" w:firstLineChars="150" w:firstLine="315"/>
-            </w:pPr>
-            <w:r>
-              <w:t>[</w:t>
-            </w:r>
-          </w:p>
-          <w:p>
-            <w:pPr>
-              <w:ind w:left="0" w:firstLineChars="150" w:firstLine="315"/>
-            </w:pPr>
-            <w:r>
-              <w:t xml:space="preserve">   {</w:t>
-            </w:r>
-          </w:p>
-          <w:p>
-            <w:pPr>
-              <w:ind w:left="0" w:firstLineChars="150" w:firstLine="315"/>
-            </w:pPr>
-            <w:r>
-              <w:t xml:space="preserve">      "Name": "/dev/mapper/vgdata-lvdata1", </w:t>
-            </w:r>
-          </w:p>
-          <w:p>
-            <w:pPr>
-              <w:ind w:left="0" w:firstLineChars="150" w:firstLine="315"/>
-            </w:pPr>
-            <w:r>
-              <w:t xml:space="preserve">      "Mount": "/home/mount", </w:t>
-            </w:r>
-          </w:p>
-          <w:p>
-            <w:pPr>
-              <w:ind w:left="0" w:firstLineChars="150" w:firstLine="315"/>
-            </w:pPr>
-            <w:r>
-              <w:t xml:space="preserve">      "Size": 32529, </w:t>
-            </w:r>
-          </w:p>
-          <w:p>
-            <w:pPr>
-              <w:ind w:left="0" w:firstLineChars="150" w:firstLine="315"/>
-            </w:pPr>
-            <w:r>
-              <w:lastRenderedPageBreak/>
               <w:t xml:space="preserve">      "Free": 6525, </w:t>
             </w:r>
           </w:p>
@@ -14592,8 +14672,8 @@
       <w:pPr>
         <w:pStyle w:val="Heading4"/>
       </w:pPr>
-      <w:bookmarkStart w:id="1" w:name="_获取业务类型列表命令"/>
-      <w:bookmarkEnd w:id="1"/>
+      <w:bookmarkStart w:id="2" w:name="_获取业务类型列表命令"/>
+      <w:bookmarkEnd w:id="2"/>
       <w:r>
         <w:rPr>
           <w:rFonts w:hint="eastAsia"/>
@@ -15350,6 +15430,7 @@
               <w:ind w:left="0"/>
             </w:pPr>
             <w:r>
+              <w:lastRenderedPageBreak/>
               <w:t>TemplateInfo</w:t>
             </w:r>
             <w:r>
@@ -15389,252 +15470,251 @@
               <w:rPr>
                 <w:rFonts w:hint="eastAsia"/>
               </w:rPr>
+              <w:t xml:space="preserve">  [</w:t>
+            </w:r>
+          </w:p>
+          <w:p>
+            <w:pPr>
+              <w:ind w:left="0" w:firstLine="405"/>
+            </w:pPr>
+            <w:r>
+              <w:rPr>
+                <w:rFonts w:hint="eastAsia"/>
+              </w:rPr>
+              <w:t>{</w:t>
+            </w:r>
+          </w:p>
+          <w:p>
+            <w:pPr>
+              <w:ind w:left="0" w:firstLine="405"/>
+            </w:pPr>
+            <w:r>
+              <w:rPr>
+                <w:rFonts w:hint="eastAsia"/>
+              </w:rPr>
+              <w:t xml:space="preserve">  Name: repliacanum</w:t>
+            </w:r>
+          </w:p>
+          <w:p>
+            <w:pPr>
+              <w:ind w:left="0" w:firstLine="405"/>
+            </w:pPr>
+            <w:r>
+              <w:rPr>
+                <w:rFonts w:hint="eastAsia"/>
+              </w:rPr>
+              <w:t xml:space="preserve">  Value: 2</w:t>
+            </w:r>
+          </w:p>
+          <w:p>
+            <w:pPr>
+              <w:ind w:left="0" w:firstLine="405"/>
+            </w:pPr>
+            <w:r>
+              <w:rPr>
+                <w:rFonts w:hint="eastAsia"/>
+              </w:rPr>
+              <w:t>}</w:t>
+            </w:r>
+          </w:p>
+          <w:p>
+            <w:pPr>
+              <w:ind w:left="0" w:firstLine="405"/>
+            </w:pPr>
+            <w:r>
+              <w:rPr>
+                <w:rFonts w:hint="eastAsia"/>
+              </w:rPr>
+              <w:t>{</w:t>
+            </w:r>
+          </w:p>
+          <w:p>
+            <w:pPr>
+              <w:ind w:left="0" w:firstLine="405"/>
+            </w:pPr>
+            <w:r>
+              <w:rPr>
+                <w:rFonts w:hint="eastAsia"/>
+              </w:rPr>
+              <w:t xml:space="preserve">  Name: datagroupnum</w:t>
+            </w:r>
+          </w:p>
+          <w:p>
+            <w:pPr>
+              <w:ind w:left="0" w:firstLine="405"/>
+            </w:pPr>
+            <w:r>
+              <w:rPr>
+                <w:rFonts w:hint="eastAsia"/>
+              </w:rPr>
+              <w:t xml:space="preserve">  Value: 2</w:t>
+            </w:r>
+          </w:p>
+          <w:p>
+            <w:pPr>
+              <w:ind w:left="0" w:firstLine="405"/>
+            </w:pPr>
+            <w:r>
+              <w:rPr>
+                <w:rFonts w:hint="eastAsia"/>
+              </w:rPr>
+              <w:t>}</w:t>
+            </w:r>
+          </w:p>
+          <w:p>
+            <w:pPr>
+              <w:ind w:left="0"/>
+            </w:pPr>
+            <w:r>
+              <w:rPr>
+                <w:rFonts w:hint="eastAsia"/>
+              </w:rPr>
+              <w:t xml:space="preserve">  ]</w:t>
+            </w:r>
+          </w:p>
+          <w:p>
+            <w:pPr>
+              <w:ind w:left="0"/>
+            </w:pPr>
+            <w:r>
+              <w:rPr>
+                <w:rFonts w:hint="eastAsia"/>
+              </w:rPr>
+              <w:t xml:space="preserve">  HostInfo</w:t>
+            </w:r>
+            <w:r>
+              <w:t>: (</w:t>
+            </w:r>
+            <w:r>
+              <w:rPr>
+                <w:rFonts w:hint="eastAsia"/>
+              </w:rPr>
+              <w:t>主机信息，可选</w:t>
+            </w:r>
+            <w:r>
+              <w:t>)</w:t>
+            </w:r>
+          </w:p>
+          <w:p>
+            <w:pPr>
+              <w:ind w:left="0"/>
+            </w:pPr>
+            <w:r>
+              <w:rPr>
+                <w:rFonts w:hint="eastAsia"/>
+              </w:rPr>
+              <w:t xml:space="preserve">  [</w:t>
+            </w:r>
+          </w:p>
+          <w:p>
+            <w:pPr>
+              <w:ind w:left="0" w:firstLine="405"/>
+            </w:pPr>
+            <w:r>
+              <w:rPr>
+                <w:rFonts w:hint="eastAsia"/>
+              </w:rPr>
+              <w:t>{</w:t>
+            </w:r>
+          </w:p>
+          <w:p>
+            <w:pPr>
+              <w:ind w:left="0" w:firstLine="405"/>
+            </w:pPr>
+            <w:r>
+              <w:rPr>
+                <w:rFonts w:hint="eastAsia"/>
+              </w:rPr>
+              <w:t xml:space="preserve">  HostName</w:t>
+            </w:r>
+            <w:r>
+              <w:rPr>
+                <w:rFonts w:hint="eastAsia"/>
+              </w:rPr>
+              <w:t xml:space="preserve">: </w:t>
+            </w:r>
+            <w:r>
+              <w:rPr>
+                <w:rFonts w:hint="eastAsia"/>
+              </w:rPr>
+              <w:t>主机名</w:t>
+            </w:r>
+          </w:p>
+          <w:p>
+            <w:pPr>
+              <w:ind w:left="0" w:firstLine="405"/>
+            </w:pPr>
+            <w:r>
+              <w:rPr>
+                <w:rFonts w:hint="eastAsia"/>
+              </w:rPr>
+              <w:t>}</w:t>
+            </w:r>
+            <w:r>
+              <w:rPr>
+                <w:rFonts w:hint="eastAsia"/>
+              </w:rPr>
+              <w:t xml:space="preserve">, </w:t>
+            </w:r>
+            <w:r>
+              <w:t>…</w:t>
+            </w:r>
+          </w:p>
+          <w:p>
+            <w:pPr>
+              <w:ind w:left="0"/>
+            </w:pPr>
+            <w:r>
+              <w:rPr>
+                <w:rFonts w:hint="eastAsia"/>
+              </w:rPr>
+              <w:t xml:space="preserve">  ]</w:t>
+            </w:r>
+          </w:p>
+          <w:p>
+            <w:pPr>
+              <w:ind w:left="0"/>
+            </w:pPr>
+            <w:r>
+              <w:rPr>
+                <w:rFonts w:hint="eastAsia"/>
+              </w:rPr>
+              <w:t xml:space="preserve">  ClusterName: </w:t>
+            </w:r>
+            <w:r>
+              <w:rPr>
+                <w:rFonts w:hint="eastAsia"/>
+              </w:rPr>
+              <w:t>集群名</w:t>
+            </w:r>
+          </w:p>
+          <w:p>
+            <w:pPr>
+              <w:ind w:left="0"/>
+            </w:pPr>
+            <w:r>
+              <w:rPr>
+                <w:rFonts w:hint="eastAsia"/>
+              </w:rPr>
+              <w:t>}</w:t>
+            </w:r>
+          </w:p>
+        </w:tc>
+        <w:tc>
+          <w:tcPr>
+            <w:tcW w:w="3544" w:type="dxa"/>
+          </w:tcPr>
+          <w:p>
+            <w:pPr>
+              <w:ind w:left="0"/>
+            </w:pPr>
+            <w:r>
               <w:lastRenderedPageBreak/>
-              <w:t xml:space="preserve">  [</w:t>
-            </w:r>
-          </w:p>
-          <w:p>
-            <w:pPr>
-              <w:ind w:left="0" w:firstLine="405"/>
-            </w:pPr>
-            <w:r>
-              <w:rPr>
-                <w:rFonts w:hint="eastAsia"/>
-              </w:rPr>
-              <w:t>{</w:t>
-            </w:r>
-          </w:p>
-          <w:p>
-            <w:pPr>
-              <w:ind w:left="0" w:firstLine="405"/>
-            </w:pPr>
-            <w:r>
-              <w:rPr>
-                <w:rFonts w:hint="eastAsia"/>
-              </w:rPr>
-              <w:t xml:space="preserve">  Name: repliacanum</w:t>
-            </w:r>
-          </w:p>
-          <w:p>
-            <w:pPr>
-              <w:ind w:left="0" w:firstLine="405"/>
-            </w:pPr>
-            <w:r>
-              <w:rPr>
-                <w:rFonts w:hint="eastAsia"/>
-              </w:rPr>
-              <w:t xml:space="preserve">  Value: 2</w:t>
-            </w:r>
-          </w:p>
-          <w:p>
-            <w:pPr>
-              <w:ind w:left="0" w:firstLine="405"/>
-            </w:pPr>
-            <w:r>
-              <w:rPr>
-                <w:rFonts w:hint="eastAsia"/>
-              </w:rPr>
-              <w:t>}</w:t>
-            </w:r>
-          </w:p>
-          <w:p>
-            <w:pPr>
-              <w:ind w:left="0" w:firstLine="405"/>
-            </w:pPr>
-            <w:r>
-              <w:rPr>
-                <w:rFonts w:hint="eastAsia"/>
-              </w:rPr>
-              <w:t>{</w:t>
-            </w:r>
-          </w:p>
-          <w:p>
-            <w:pPr>
-              <w:ind w:left="0" w:firstLine="405"/>
-            </w:pPr>
-            <w:r>
-              <w:rPr>
-                <w:rFonts w:hint="eastAsia"/>
-              </w:rPr>
-              <w:t xml:space="preserve">  Name: datagroupnum</w:t>
-            </w:r>
-          </w:p>
-          <w:p>
-            <w:pPr>
-              <w:ind w:left="0" w:firstLine="405"/>
-            </w:pPr>
-            <w:r>
-              <w:rPr>
-                <w:rFonts w:hint="eastAsia"/>
-              </w:rPr>
-              <w:t xml:space="preserve">  Value: 2</w:t>
-            </w:r>
-          </w:p>
-          <w:p>
-            <w:pPr>
-              <w:ind w:left="0" w:firstLine="405"/>
-            </w:pPr>
-            <w:r>
-              <w:rPr>
-                <w:rFonts w:hint="eastAsia"/>
-              </w:rPr>
-              <w:t>}</w:t>
-            </w:r>
-          </w:p>
-          <w:p>
-            <w:pPr>
-              <w:ind w:left="0"/>
-            </w:pPr>
-            <w:r>
-              <w:rPr>
-                <w:rFonts w:hint="eastAsia"/>
-              </w:rPr>
-              <w:t xml:space="preserve">  ]</w:t>
-            </w:r>
-          </w:p>
-          <w:p>
-            <w:pPr>
-              <w:ind w:left="0"/>
-            </w:pPr>
-            <w:r>
-              <w:rPr>
-                <w:rFonts w:hint="eastAsia"/>
-              </w:rPr>
-              <w:t xml:space="preserve">  HostInfo</w:t>
-            </w:r>
-            <w:r>
-              <w:t>: (</w:t>
-            </w:r>
-            <w:r>
-              <w:rPr>
-                <w:rFonts w:hint="eastAsia"/>
-              </w:rPr>
-              <w:t>主机信息，可选</w:t>
-            </w:r>
-            <w:r>
-              <w:t>)</w:t>
-            </w:r>
-          </w:p>
-          <w:p>
-            <w:pPr>
-              <w:ind w:left="0"/>
-            </w:pPr>
-            <w:r>
-              <w:rPr>
-                <w:rFonts w:hint="eastAsia"/>
-              </w:rPr>
-              <w:t xml:space="preserve">  [</w:t>
-            </w:r>
-          </w:p>
-          <w:p>
-            <w:pPr>
-              <w:ind w:left="0" w:firstLine="405"/>
-            </w:pPr>
-            <w:r>
-              <w:rPr>
-                <w:rFonts w:hint="eastAsia"/>
-              </w:rPr>
-              <w:t>{</w:t>
-            </w:r>
-          </w:p>
-          <w:p>
-            <w:pPr>
-              <w:ind w:left="0" w:firstLine="405"/>
-            </w:pPr>
-            <w:r>
-              <w:rPr>
-                <w:rFonts w:hint="eastAsia"/>
-              </w:rPr>
-              <w:t xml:space="preserve">  HostName</w:t>
-            </w:r>
-            <w:r>
-              <w:rPr>
-                <w:rFonts w:hint="eastAsia"/>
-              </w:rPr>
-              <w:t xml:space="preserve">: </w:t>
-            </w:r>
-            <w:r>
-              <w:rPr>
-                <w:rFonts w:hint="eastAsia"/>
-              </w:rPr>
-              <w:t>主机名</w:t>
-            </w:r>
-          </w:p>
-          <w:p>
-            <w:pPr>
-              <w:ind w:left="0" w:firstLine="405"/>
-            </w:pPr>
-            <w:r>
-              <w:rPr>
-                <w:rFonts w:hint="eastAsia"/>
-              </w:rPr>
-              <w:t>}</w:t>
-            </w:r>
-            <w:r>
-              <w:rPr>
-                <w:rFonts w:hint="eastAsia"/>
-              </w:rPr>
-              <w:t xml:space="preserve">, </w:t>
-            </w:r>
-            <w:r>
-              <w:t>…</w:t>
-            </w:r>
-          </w:p>
-          <w:p>
-            <w:pPr>
-              <w:ind w:left="0"/>
-            </w:pPr>
-            <w:r>
-              <w:rPr>
-                <w:rFonts w:hint="eastAsia"/>
-              </w:rPr>
-              <w:t xml:space="preserve">  ]</w:t>
-            </w:r>
-          </w:p>
-          <w:p>
-            <w:pPr>
-              <w:ind w:left="0"/>
-            </w:pPr>
-            <w:r>
-              <w:rPr>
-                <w:rFonts w:hint="eastAsia"/>
-              </w:rPr>
-              <w:t xml:space="preserve">  ClusterName: </w:t>
-            </w:r>
-            <w:r>
-              <w:rPr>
-                <w:rFonts w:hint="eastAsia"/>
-              </w:rPr>
-              <w:t>集群名</w:t>
-            </w:r>
-          </w:p>
-          <w:p>
-            <w:pPr>
-              <w:ind w:left="0"/>
-            </w:pPr>
-            <w:r>
-              <w:rPr>
-                <w:rFonts w:hint="eastAsia"/>
-              </w:rPr>
-              <w:t>}</w:t>
-            </w:r>
-          </w:p>
-        </w:tc>
-        <w:tc>
-          <w:tcPr>
-            <w:tcW w:w="3544" w:type="dxa"/>
-          </w:tcPr>
-          <w:p>
-            <w:pPr>
-              <w:ind w:left="0"/>
-            </w:pPr>
+              <w:t xml:space="preserve">cmd=predict </w:t>
+            </w:r>
             <w:r>
               <w:lastRenderedPageBreak/>
-              <w:t xml:space="preserve">cmd=predict capacity&amp;TemplateInfo={ClusterName:"c1", Property:[{Name:"replicanum", Value:"2"}, {Name:"datagroupnum", </w:t>
-            </w:r>
-            <w:r>
-              <w:lastRenderedPageBreak/>
-              <w:t>Value:"2"}], HostInfo:[{HostName:"rhe</w:t>
+              <w:t>capacity&amp;TemplateInfo={ClusterName:"c1", Property:[{Name:"replicanum", Value:"2"}, {Name:"datagroupnum", Value:"2"}], HostInfo:[{HostName:"rhe</w:t>
             </w:r>
           </w:p>
           <w:p>
@@ -16328,6 +16408,7 @@
               <w:rPr>
                 <w:rFonts w:hint="eastAsia"/>
               </w:rPr>
+              <w:lastRenderedPageBreak/>
               <w:t>响应头</w:t>
             </w:r>
           </w:p>
@@ -16375,7 +16456,6 @@
               <w:rPr>
                 <w:rFonts w:hint="eastAsia"/>
               </w:rPr>
-              <w:lastRenderedPageBreak/>
               <w:t>响应内容</w:t>
             </w:r>
           </w:p>
@@ -17584,36 +17664,36 @@
               <w:rPr>
                 <w:rFonts w:hint="eastAsia"/>
               </w:rPr>
-              <w:t xml:space="preserve">  </w:t>
-            </w:r>
-            <w:r>
-              <w:t>Name</w:t>
-            </w:r>
-            <w:r>
-              <w:rPr>
-                <w:rFonts w:hint="eastAsia"/>
-              </w:rPr>
-              <w:t xml:space="preserve">: </w:t>
-            </w:r>
-            <w:r>
-              <w:rPr>
-                <w:rFonts w:hint="eastAsia"/>
-              </w:rPr>
-              <w:t>配置项的名字</w:t>
-            </w:r>
-          </w:p>
-          <w:p>
-            <w:pPr>
-              <w:ind w:left="0" w:firstLine="405"/>
-            </w:pPr>
-            <w:r>
-              <w:rPr>
-                <w:rFonts w:hint="eastAsia"/>
-              </w:rPr>
               <w:lastRenderedPageBreak/>
               <w:t xml:space="preserve">  </w:t>
             </w:r>
             <w:r>
+              <w:t>Name</w:t>
+            </w:r>
+            <w:r>
+              <w:rPr>
+                <w:rFonts w:hint="eastAsia"/>
+              </w:rPr>
+              <w:t xml:space="preserve">: </w:t>
+            </w:r>
+            <w:r>
+              <w:rPr>
+                <w:rFonts w:hint="eastAsia"/>
+              </w:rPr>
+              <w:t>配置项的名字</w:t>
+            </w:r>
+          </w:p>
+          <w:p>
+            <w:pPr>
+              <w:ind w:left="0" w:firstLine="405"/>
+            </w:pPr>
+            <w:r>
+              <w:rPr>
+                <w:rFonts w:hint="eastAsia"/>
+              </w:rPr>
+              <w:t xml:space="preserve">  </w:t>
+            </w:r>
+            <w:r>
               <w:rPr>
                 <w:rFonts w:hint="eastAsia"/>
               </w:rPr>
@@ -17851,6 +17931,7 @@
               <w:ind w:left="0" w:firstLineChars="300" w:firstLine="630"/>
             </w:pPr>
             <w:r>
+              <w:lastRenderedPageBreak/>
               <w:t>"Name"</w:t>
             </w:r>
             <w:r>
@@ -17865,7 +17946,6 @@
               <w:ind w:left="0" w:firstLineChars="300" w:firstLine="630"/>
             </w:pPr>
             <w:r>
-              <w:lastRenderedPageBreak/>
               <w:t>"Value"</w:t>
             </w:r>
             <w:r>
@@ -18744,6 +18824,7 @@
               <w:rPr>
                 <w:rFonts w:hint="eastAsia"/>
               </w:rPr>
+              <w:lastRenderedPageBreak/>
               <w:t xml:space="preserve">  </w:t>
             </w:r>
             <w:r>
@@ -18791,7 +18872,6 @@
               <w:ind w:left="0" w:firstLineChars="291" w:firstLine="611"/>
             </w:pPr>
             <w:r>
-              <w:lastRenderedPageBreak/>
               <w:t>Display</w:t>
             </w:r>
             <w:r>
@@ -19276,6 +19356,7 @@
               <w:ind w:left="0" w:firstLineChars="300" w:firstLine="630"/>
             </w:pPr>
             <w:r>
+              <w:lastRenderedPageBreak/>
               <w:t>"WebName"</w:t>
             </w:r>
             <w:r>
@@ -19299,7 +19380,6 @@
               <w:ind w:left="0" w:firstLineChars="300" w:firstLine="630"/>
             </w:pPr>
             <w:r>
-              <w:lastRenderedPageBreak/>
               <w:t>"Type"</w:t>
             </w:r>
             <w:r>
@@ -21926,8 +22006,7 @@
             <w:pPr>
               <w:ind w:left="0"/>
               <w:rPr>
-                <w:ins w:id="2" w:author="xujianhui" w:date="2016-05-19T17:01:00Z"/>
-                <w:rFonts w:hint="eastAsia"/>
+                <w:ins w:id="3" w:author="xujianhui" w:date="2016-05-19T17:01:00Z"/>
               </w:rPr>
             </w:pPr>
             <w:r>
@@ -21944,10 +22023,10 @@
             <w:pPr>
               <w:ind w:left="0"/>
               <w:rPr>
-                <w:ins w:id="3" w:author="xujianhui" w:date="2016-05-19T17:01:00Z"/>
-              </w:rPr>
-            </w:pPr>
-            <w:ins w:id="4" w:author="xujianhui" w:date="2016-05-19T17:01:00Z">
+                <w:ins w:id="4" w:author="xujianhui" w:date="2016-05-19T17:01:00Z"/>
+              </w:rPr>
+            </w:pPr>
+            <w:ins w:id="5" w:author="xujianhui" w:date="2016-05-19T17:01:00Z">
               <w:r>
                 <w:rPr>
                   <w:rFonts w:hint="eastAsia"/>
@@ -21960,10 +22039,10 @@
             <w:pPr>
               <w:ind w:left="0"/>
               <w:rPr>
-                <w:ins w:id="5" w:author="xujianhui" w:date="2016-05-19T17:01:00Z"/>
-              </w:rPr>
-            </w:pPr>
-            <w:ins w:id="6" w:author="xujianhui" w:date="2016-05-19T17:01:00Z">
+                <w:ins w:id="6" w:author="xujianhui" w:date="2016-05-19T17:01:00Z"/>
+              </w:rPr>
+            </w:pPr>
+            <w:ins w:id="7" w:author="xujianhui" w:date="2016-05-19T17:01:00Z">
               <w:r>
                 <w:rPr>
                   <w:rFonts w:hint="eastAsia"/>
@@ -21976,10 +22055,10 @@
             <w:pPr>
               <w:ind w:left="0"/>
               <w:rPr>
-                <w:ins w:id="7" w:author="xujianhui" w:date="2016-05-19T17:01:00Z"/>
-              </w:rPr>
-            </w:pPr>
-            <w:ins w:id="8" w:author="xujianhui" w:date="2016-05-19T17:01:00Z">
+                <w:ins w:id="8" w:author="xujianhui" w:date="2016-05-19T17:01:00Z"/>
+              </w:rPr>
+            </w:pPr>
+            <w:ins w:id="9" w:author="xujianhui" w:date="2016-05-19T17:01:00Z">
               <w:r>
                 <w:rPr>
                   <w:rFonts w:hint="eastAsia"/>
@@ -21992,11 +22071,10 @@
             <w:pPr>
               <w:ind w:left="0"/>
               <w:rPr>
-                <w:ins w:id="9" w:author="xujianhui" w:date="2016-05-19T17:01:00Z"/>
-                <w:rFonts w:hint="eastAsia"/>
-              </w:rPr>
-            </w:pPr>
-            <w:ins w:id="10" w:author="xujianhui" w:date="2016-05-19T17:01:00Z">
+                <w:ins w:id="10" w:author="xujianhui" w:date="2016-05-19T17:01:00Z"/>
+              </w:rPr>
+            </w:pPr>
+            <w:ins w:id="11" w:author="xujianhui" w:date="2016-05-19T17:01:00Z">
               <w:r>
                 <w:rPr>
                   <w:rFonts w:hint="eastAsia"/>
@@ -22009,11 +22087,10 @@
             <w:pPr>
               <w:ind w:left="0"/>
               <w:rPr>
-                <w:ins w:id="11" w:author="xujianhui" w:date="2016-05-19T17:01:00Z"/>
-                <w:rFonts w:hint="eastAsia"/>
-              </w:rPr>
-            </w:pPr>
-            <w:ins w:id="12" w:author="xujianhui" w:date="2016-05-19T17:01:00Z">
+                <w:ins w:id="12" w:author="xujianhui" w:date="2016-05-19T17:01:00Z"/>
+              </w:rPr>
+            </w:pPr>
+            <w:ins w:id="13" w:author="xujianhui" w:date="2016-05-19T17:01:00Z">
               <w:r>
                 <w:rPr>
                   <w:rFonts w:hint="eastAsia"/>
@@ -22026,7 +22103,7 @@
             <w:pPr>
               <w:ind w:left="0"/>
             </w:pPr>
-            <w:ins w:id="13" w:author="xujianhui" w:date="2016-05-19T17:01:00Z">
+            <w:ins w:id="14" w:author="xujianhui" w:date="2016-05-19T17:01:00Z">
               <w:r>
                 <w:rPr>
                   <w:rFonts w:hint="eastAsia"/>
@@ -22254,8 +22331,7 @@
             <w:pPr>
               <w:ind w:left="0" w:firstLineChars="150" w:firstLine="315"/>
               <w:rPr>
-                <w:ins w:id="14" w:author="xujianhui" w:date="2016-05-19T17:02:00Z"/>
-                <w:rFonts w:hint="eastAsia"/>
+                <w:ins w:id="15" w:author="xujianhui" w:date="2016-05-19T17:02:00Z"/>
               </w:rPr>
             </w:pPr>
             <w:r>
@@ -22281,22 +22357,15 @@
             <w:pPr>
               <w:ind w:left="0" w:firstLineChars="150" w:firstLine="315"/>
               <w:rPr>
-                <w:ins w:id="15" w:author="xujianhui" w:date="2016-05-19T17:03:00Z"/>
-                <w:rFonts w:hint="eastAsia"/>
-              </w:rPr>
-            </w:pPr>
-            <w:ins w:id="16" w:author="xujianhui" w:date="2016-05-19T17:03:00Z">
+                <w:ins w:id="16" w:author="xujianhui" w:date="2016-05-19T17:03:00Z"/>
+              </w:rPr>
+            </w:pPr>
+            <w:ins w:id="17" w:author="xujianhui" w:date="2016-05-19T17:03:00Z">
               <w:r>
                 <w:rPr>
                   <w:rFonts w:hint="eastAsia"/>
                 </w:rPr>
-                <w:t>Status</w:t>
-              </w:r>
-              <w:r>
-                <w:rPr>
-                  <w:rFonts w:hint="eastAsia"/>
-                </w:rPr>
-                <w:t xml:space="preserve">: </w:t>
+                <w:t xml:space="preserve">Status: </w:t>
               </w:r>
               <w:r>
                 <w:rPr>
@@ -22310,18 +22379,12 @@
             <w:pPr>
               <w:ind w:left="0" w:firstLineChars="150" w:firstLine="315"/>
             </w:pPr>
-            <w:ins w:id="17" w:author="xujianhui" w:date="2016-05-19T17:03:00Z">
+            <w:ins w:id="18" w:author="xujianhui" w:date="2016-05-19T17:03:00Z">
               <w:r>
                 <w:rPr>
                   <w:rFonts w:hint="eastAsia"/>
                 </w:rPr>
-                <w:t>StatusDesc</w:t>
-              </w:r>
-              <w:r>
-                <w:rPr>
-                  <w:rFonts w:hint="eastAsia"/>
-                </w:rPr>
-                <w:t xml:space="preserve">: </w:t>
+                <w:t xml:space="preserve">StatusDesc: </w:t>
               </w:r>
               <w:r>
                 <w:rPr>
@@ -22425,8 +22488,7 @@
             <w:pPr>
               <w:ind w:left="0" w:firstLineChars="150" w:firstLine="315"/>
               <w:rPr>
-                <w:ins w:id="18" w:author="xujianhui" w:date="2016-05-19T17:04:00Z"/>
-                <w:rFonts w:hint="eastAsia"/>
+                <w:ins w:id="19" w:author="xujianhui" w:date="2016-05-19T17:04:00Z"/>
               </w:rPr>
             </w:pPr>
             <w:r>
@@ -22437,11 +22499,10 @@
             <w:pPr>
               <w:ind w:left="0" w:firstLineChars="150" w:firstLine="315"/>
               <w:rPr>
-                <w:ins w:id="19" w:author="xujianhui" w:date="2016-05-19T17:04:00Z"/>
-                <w:rFonts w:hint="eastAsia"/>
-              </w:rPr>
-            </w:pPr>
-            <w:ins w:id="20" w:author="xujianhui" w:date="2016-05-19T17:04:00Z">
+                <w:ins w:id="20" w:author="xujianhui" w:date="2016-05-19T17:04:00Z"/>
+              </w:rPr>
+            </w:pPr>
+            <w:ins w:id="21" w:author="xujianhui" w:date="2016-05-19T17:04:00Z">
               <w:r>
                 <w:t>“</w:t>
               </w:r>
@@ -22466,7 +22527,7 @@
             <w:pPr>
               <w:ind w:left="0" w:firstLineChars="150" w:firstLine="315"/>
             </w:pPr>
-            <w:ins w:id="21" w:author="xujianhui" w:date="2016-05-19T17:04:00Z">
+            <w:ins w:id="22" w:author="xujianhui" w:date="2016-05-19T17:04:00Z">
               <w:r>
                 <w:t>“</w:t>
               </w:r>
@@ -22769,8 +22830,7 @@
             <w:pPr>
               <w:ind w:left="0"/>
               <w:rPr>
-                <w:ins w:id="22" w:author="xujianhui" w:date="2016-05-19T16:53:00Z"/>
-                <w:rFonts w:hint="eastAsia"/>
+                <w:ins w:id="23" w:author="xujianhui" w:date="2016-05-19T16:53:00Z"/>
               </w:rPr>
             </w:pPr>
             <w:r>
@@ -22784,11 +22844,10 @@
             <w:pPr>
               <w:ind w:left="0"/>
               <w:rPr>
-                <w:ins w:id="23" w:author="xujianhui" w:date="2016-05-19T16:53:00Z"/>
-                <w:rFonts w:hint="eastAsia"/>
-              </w:rPr>
-            </w:pPr>
-            <w:ins w:id="24" w:author="xujianhui" w:date="2016-05-19T16:53:00Z">
+                <w:ins w:id="24" w:author="xujianhui" w:date="2016-05-19T16:53:00Z"/>
+              </w:rPr>
+            </w:pPr>
+            <w:ins w:id="25" w:author="xujianhui" w:date="2016-05-19T16:53:00Z">
               <w:r>
                 <w:rPr>
                   <w:rFonts w:hint="eastAsia"/>
@@ -22801,7 +22860,7 @@
             <w:pPr>
               <w:ind w:left="0"/>
             </w:pPr>
-            <w:ins w:id="25" w:author="xujianhui" w:date="2016-05-19T16:53:00Z">
+            <w:ins w:id="26" w:author="xujianhui" w:date="2016-05-19T16:53:00Z">
               <w:r>
                 <w:rPr>
                   <w:rFonts w:hint="eastAsia"/>
@@ -23709,13 +23768,13 @@
             <w:pPr>
               <w:ind w:left="0"/>
               <w:rPr>
-                <w:ins w:id="26" w:author="xujianhui" w:date="2016-05-19T16:31:00Z"/>
+                <w:ins w:id="27" w:author="xujianhui" w:date="2016-05-19T16:31:00Z"/>
               </w:rPr>
             </w:pPr>
             <w:r>
               <w:rPr>
                 <w:highlight w:val="lightGray"/>
-                <w:rPrChange w:id="27" w:author="xujianhui" w:date="2016-05-19T16:31:00Z">
+                <w:rPrChange w:id="28" w:author="xujianhui" w:date="2016-05-19T16:31:00Z">
                   <w:rPr/>
                 </w:rPrChange>
               </w:rPr>
@@ -23725,7 +23784,7 @@
               <w:rPr>
                 <w:rFonts w:hint="eastAsia"/>
                 <w:highlight w:val="lightGray"/>
-                <w:rPrChange w:id="28" w:author="xujianhui" w:date="2016-05-19T16:31:00Z">
+                <w:rPrChange w:id="29" w:author="xujianhui" w:date="2016-05-19T16:31:00Z">
                   <w:rPr>
                     <w:rFonts w:hint="eastAsia"/>
                   </w:rPr>
@@ -23736,7 +23795,7 @@
             <w:r>
               <w:rPr>
                 <w:highlight w:val="lightGray"/>
-                <w:rPrChange w:id="29" w:author="xujianhui" w:date="2016-05-19T16:31:00Z">
+                <w:rPrChange w:id="30" w:author="xujianhui" w:date="2016-05-19T16:31:00Z">
                   <w:rPr/>
                 </w:rPrChange>
               </w:rPr>
@@ -23746,7 +23805,7 @@
               <w:rPr>
                 <w:rFonts w:hint="eastAsia"/>
                 <w:highlight w:val="lightGray"/>
-                <w:rPrChange w:id="30" w:author="xujianhui" w:date="2016-05-19T16:31:00Z">
+                <w:rPrChange w:id="31" w:author="xujianhui" w:date="2016-05-19T16:31:00Z">
                   <w:rPr>
                     <w:rFonts w:hint="eastAsia"/>
                   </w:rPr>
@@ -23754,7 +23813,7 @@
               </w:rPr>
               <w:t>）</w:t>
             </w:r>
-            <w:ins w:id="31" w:author="xujianhui" w:date="2016-05-19T16:31:00Z">
+            <w:ins w:id="32" w:author="xujianhui" w:date="2016-05-19T16:31:00Z">
               <w:r>
                 <w:rPr>
                   <w:rFonts w:hint="eastAsia"/>
@@ -23762,7 +23821,7 @@
                 <w:t>（保持兼容</w:t>
               </w:r>
             </w:ins>
-            <w:ins w:id="32" w:author="xujianhui" w:date="2016-05-19T16:36:00Z">
+            <w:ins w:id="33" w:author="xujianhui" w:date="2016-05-19T16:36:00Z">
               <w:r>
                 <w:rPr>
                   <w:rFonts w:hint="eastAsia"/>
@@ -23789,7 +23848,7 @@
                 <w:t>进行处理</w:t>
               </w:r>
             </w:ins>
-            <w:ins w:id="33" w:author="xujianhui" w:date="2016-05-19T16:31:00Z">
+            <w:ins w:id="34" w:author="xujianhui" w:date="2016-05-19T16:31:00Z">
               <w:r>
                 <w:rPr>
                   <w:rFonts w:hint="eastAsia"/>
@@ -23802,10 +23861,10 @@
             <w:pPr>
               <w:ind w:left="0"/>
               <w:rPr>
-                <w:ins w:id="34" w:author="xujianhui" w:date="2016-05-19T16:31:00Z"/>
-              </w:rPr>
-            </w:pPr>
-            <w:ins w:id="35" w:author="xujianhui" w:date="2016-05-19T16:31:00Z">
+                <w:ins w:id="35" w:author="xujianhui" w:date="2016-05-19T16:31:00Z"/>
+              </w:rPr>
+            </w:pPr>
+            <w:ins w:id="36" w:author="xujianhui" w:date="2016-05-19T16:31:00Z">
               <w:r>
                 <w:rPr>
                   <w:rFonts w:hint="eastAsia"/>
@@ -23818,10 +23877,10 @@
             <w:pPr>
               <w:ind w:left="0"/>
               <w:rPr>
-                <w:ins w:id="36" w:author="xujianhui" w:date="2016-05-19T16:31:00Z"/>
-              </w:rPr>
-            </w:pPr>
-            <w:ins w:id="37" w:author="xujianhui" w:date="2016-05-19T16:31:00Z">
+                <w:ins w:id="37" w:author="xujianhui" w:date="2016-05-19T16:31:00Z"/>
+              </w:rPr>
+            </w:pPr>
+            <w:ins w:id="38" w:author="xujianhui" w:date="2016-05-19T16:31:00Z">
               <w:r>
                 <w:rPr>
                   <w:rFonts w:hint="eastAsia"/>
@@ -23834,10 +23893,10 @@
             <w:pPr>
               <w:ind w:left="0"/>
               <w:rPr>
-                <w:ins w:id="38" w:author="xujianhui" w:date="2016-05-19T16:31:00Z"/>
-              </w:rPr>
-            </w:pPr>
-            <w:ins w:id="39" w:author="xujianhui" w:date="2016-05-19T16:31:00Z">
+                <w:ins w:id="39" w:author="xujianhui" w:date="2016-05-19T16:31:00Z"/>
+              </w:rPr>
+            </w:pPr>
+            <w:ins w:id="40" w:author="xujianhui" w:date="2016-05-19T16:31:00Z">
               <w:r>
                 <w:rPr>
                   <w:rFonts w:hint="eastAsia"/>
@@ -23850,10 +23909,10 @@
             <w:pPr>
               <w:ind w:left="0"/>
               <w:rPr>
-                <w:ins w:id="40" w:author="xujianhui" w:date="2016-05-19T16:31:00Z"/>
-              </w:rPr>
-            </w:pPr>
-            <w:ins w:id="41" w:author="xujianhui" w:date="2016-05-19T16:31:00Z">
+                <w:ins w:id="41" w:author="xujianhui" w:date="2016-05-19T16:31:00Z"/>
+              </w:rPr>
+            </w:pPr>
+            <w:ins w:id="42" w:author="xujianhui" w:date="2016-05-19T16:31:00Z">
               <w:r>
                 <w:rPr>
                   <w:rFonts w:hint="eastAsia"/>
@@ -23866,10 +23925,10 @@
             <w:pPr>
               <w:ind w:left="0"/>
               <w:rPr>
-                <w:ins w:id="42" w:author="xujianhui" w:date="2016-05-19T16:31:00Z"/>
-              </w:rPr>
-            </w:pPr>
-            <w:ins w:id="43" w:author="xujianhui" w:date="2016-05-19T16:31:00Z">
+                <w:ins w:id="43" w:author="xujianhui" w:date="2016-05-19T16:31:00Z"/>
+              </w:rPr>
+            </w:pPr>
+            <w:ins w:id="44" w:author="xujianhui" w:date="2016-05-19T16:31:00Z">
               <w:r>
                 <w:rPr>
                   <w:rFonts w:hint="eastAsia"/>
@@ -23882,7 +23941,7 @@
             <w:pPr>
               <w:ind w:left="0"/>
             </w:pPr>
-            <w:ins w:id="44" w:author="xujianhui" w:date="2016-05-19T16:31:00Z">
+            <w:ins w:id="45" w:author="xujianhui" w:date="2016-05-19T16:31:00Z">
               <w:r>
                 <w:rPr>
                   <w:rFonts w:hint="eastAsia"/>
@@ -24131,25 +24190,25 @@
               <w:ind w:left="0" w:firstLineChars="150" w:firstLine="315"/>
               <w:rPr>
                 <w:highlight w:val="yellow"/>
-                <w:rPrChange w:id="45" w:author="xujianhui" w:date="2016-05-19T16:32:00Z">
-                  <w:rPr/>
-                </w:rPrChange>
-              </w:rPr>
-            </w:pPr>
-            <w:r>
-              <w:rPr>
-                <w:highlight w:val="yellow"/>
                 <w:rPrChange w:id="46" w:author="xujianhui" w:date="2016-05-19T16:32:00Z">
                   <w:rPr/>
                 </w:rPrChange>
               </w:rPr>
-              <w:t xml:space="preserve">ClusterName:  </w:t>
-            </w:r>
-            <w:r>
-              <w:rPr>
-                <w:rFonts w:hint="eastAsia"/>
+            </w:pPr>
+            <w:r>
+              <w:rPr>
                 <w:highlight w:val="yellow"/>
                 <w:rPrChange w:id="47" w:author="xujianhui" w:date="2016-05-19T16:32:00Z">
+                  <w:rPr/>
+                </w:rPrChange>
+              </w:rPr>
+              <w:t xml:space="preserve">ClusterName:  </w:t>
+            </w:r>
+            <w:r>
+              <w:rPr>
+                <w:rFonts w:hint="eastAsia"/>
+                <w:highlight w:val="yellow"/>
+                <w:rPrChange w:id="48" w:author="xujianhui" w:date="2016-05-19T16:32:00Z">
                   <w:rPr>
                     <w:rFonts w:hint="eastAsia"/>
                   </w:rPr>
@@ -24165,7 +24224,7 @@
             <w:r>
               <w:rPr>
                 <w:highlight w:val="yellow"/>
-                <w:rPrChange w:id="48" w:author="xujianhui" w:date="2016-05-19T16:32:00Z">
+                <w:rPrChange w:id="49" w:author="xujianhui" w:date="2016-05-19T16:32:00Z">
                   <w:rPr/>
                 </w:rPrChange>
               </w:rPr>
@@ -24175,7 +24234,7 @@
               <w:rPr>
                 <w:rFonts w:hint="eastAsia"/>
                 <w:highlight w:val="yellow"/>
-                <w:rPrChange w:id="49" w:author="xujianhui" w:date="2016-05-19T16:32:00Z">
+                <w:rPrChange w:id="50" w:author="xujianhui" w:date="2016-05-19T16:32:00Z">
                   <w:rPr>
                     <w:rFonts w:hint="eastAsia"/>
                   </w:rPr>
@@ -24269,7 +24328,7 @@
             <w:pPr>
               <w:ind w:left="0" w:firstLineChars="150" w:firstLine="315"/>
               <w:rPr>
-                <w:ins w:id="50" w:author="xujianhui" w:date="2016-05-19T16:32:00Z"/>
+                <w:ins w:id="51" w:author="xujianhui" w:date="2016-05-19T16:32:00Z"/>
               </w:rPr>
             </w:pPr>
             <w:r>
@@ -24280,10 +24339,10 @@
             <w:pPr>
               <w:ind w:left="0" w:firstLineChars="150" w:firstLine="315"/>
               <w:rPr>
-                <w:ins w:id="51" w:author="xujianhui" w:date="2016-05-19T16:32:00Z"/>
-              </w:rPr>
-            </w:pPr>
-            <w:ins w:id="52" w:author="xujianhui" w:date="2016-05-19T16:32:00Z">
+                <w:ins w:id="52" w:author="xujianhui" w:date="2016-05-19T16:32:00Z"/>
+              </w:rPr>
+            </w:pPr>
+            <w:ins w:id="53" w:author="xujianhui" w:date="2016-05-19T16:32:00Z">
               <w:r>
                 <w:t>“</w:t>
               </w:r>
@@ -24320,7 +24379,7 @@
             <w:pPr>
               <w:ind w:left="0" w:firstLineChars="150" w:firstLine="315"/>
             </w:pPr>
-            <w:ins w:id="53" w:author="xujianhui" w:date="2016-05-19T16:32:00Z">
+            <w:ins w:id="54" w:author="xujianhui" w:date="2016-05-19T16:32:00Z">
               <w:r>
                 <w:t>“</w:t>
               </w:r>
@@ -24414,7 +24473,7 @@
         <w:pStyle w:val="Heading4"/>
         <w:rPr>
           <w:color w:val="FF0000"/>
-          <w:rPrChange w:id="54" w:author="xujianhui" w:date="2016-05-19T16:35:00Z">
+          <w:rPrChange w:id="55" w:author="xujianhui" w:date="2016-05-19T16:35:00Z">
             <w:rPr/>
           </w:rPrChange>
         </w:rPr>
@@ -24423,7 +24482,7 @@
         <w:rPr>
           <w:rFonts w:hint="eastAsia"/>
           <w:color w:val="FF0000"/>
-          <w:rPrChange w:id="55" w:author="xujianhui" w:date="2016-05-19T16:35:00Z">
+          <w:rPrChange w:id="56" w:author="xujianhui" w:date="2016-05-19T16:35:00Z">
             <w:rPr>
               <w:rFonts w:asciiTheme="minorHAnsi" w:eastAsiaTheme="minorEastAsia" w:hAnsiTheme="minorHAnsi" w:cstheme="minorBidi" w:hint="eastAsia"/>
               <w:b w:val="0"/>
@@ -24435,7 +24494,7 @@
         </w:rPr>
         <w:t>获取主机业务列表命令</w:t>
       </w:r>
-      <w:ins w:id="56" w:author="xujianhui" w:date="2016-05-19T16:35:00Z">
+      <w:ins w:id="57" w:author="xujianhui" w:date="2016-05-19T16:35:00Z">
         <w:r>
           <w:rPr>
             <w:rFonts w:hint="eastAsia"/>
@@ -24444,7 +24503,7 @@
           <w:t>（和上述命令合</w:t>
         </w:r>
       </w:ins>
-      <w:ins w:id="57" w:author="xujianhui" w:date="2016-05-19T16:36:00Z">
+      <w:ins w:id="58" w:author="xujianhui" w:date="2016-05-19T16:36:00Z">
         <w:r>
           <w:rPr>
             <w:rFonts w:hint="eastAsia"/>
@@ -25241,6 +25300,40 @@
               <w:t>hinter: object</w:t>
             </w:r>
           </w:p>
+          <w:p>
+            <w:pPr>
+              <w:ind w:left="0"/>
+            </w:pPr>
+            <w:r>
+              <w:rPr>
+                <w:rFonts w:hint="eastAsia"/>
+              </w:rPr>
+              <w:t>skip:</w:t>
+            </w:r>
+            <w:r>
+              <w:rPr>
+                <w:rFonts w:hint="eastAsia"/>
+              </w:rPr>
+              <w:t>跳过记录数</w:t>
+            </w:r>
+          </w:p>
+          <w:p>
+            <w:pPr>
+              <w:ind w:left="0"/>
+            </w:pPr>
+            <w:r>
+              <w:rPr>
+                <w:rFonts w:hint="eastAsia"/>
+              </w:rPr>
+              <w:t>limit:</w:t>
+            </w:r>
+            <w:r>
+              <w:rPr>
+                <w:rFonts w:hint="eastAsia"/>
+              </w:rPr>
+              <w:t>查询记录数</w:t>
+            </w:r>
+          </w:p>
         </w:tc>
         <w:tc>
           <w:tcPr>
@@ -26317,6 +26410,7 @@
               <w:ind w:left="0"/>
             </w:pPr>
             <w:r>
+              <w:lastRenderedPageBreak/>
               <w:t>}</w:t>
             </w:r>
           </w:p>
@@ -26333,7 +26427,6 @@
               <w:ind w:left="0" w:firstLineChars="150" w:firstLine="315"/>
             </w:pPr>
             <w:r>
-              <w:lastRenderedPageBreak/>
               <w:t xml:space="preserve">"HostName": "rhelt10", </w:t>
             </w:r>
           </w:p>
@@ -27152,6 +27245,7 @@
               <w:rPr>
                 <w:rFonts w:hint="eastAsia"/>
               </w:rPr>
+              <w:lastRenderedPageBreak/>
               <w:t xml:space="preserve">logbuffsize: </w:t>
             </w:r>
             <w:r>
@@ -27175,14 +27269,7 @@
               <w:rPr>
                 <w:rFonts w:hint="eastAsia"/>
               </w:rPr>
-              <w:t>数据预取代理池最</w:t>
-            </w:r>
-            <w:r>
-              <w:rPr>
-                <w:rFonts w:hint="eastAsia"/>
-              </w:rPr>
-              <w:lastRenderedPageBreak/>
-              <w:t>大数量</w:t>
+              <w:t>数据预取代理池最大数量</w:t>
             </w:r>
           </w:p>
           <w:p>
@@ -27444,6 +27531,7 @@
               <w:ind w:left="0" w:firstLineChars="150" w:firstLine="315"/>
             </w:pPr>
             <w:r>
+              <w:lastRenderedPageBreak/>
               <w:t xml:space="preserve">"logbuffsize": 1024, </w:t>
             </w:r>
           </w:p>
@@ -27460,7 +27548,6 @@
               <w:ind w:left="0" w:firstLineChars="150" w:firstLine="315"/>
             </w:pPr>
             <w:r>
-              <w:lastRenderedPageBreak/>
               <w:t xml:space="preserve">"maxreplsync": 10, </w:t>
             </w:r>
           </w:p>
@@ -28308,6 +28395,7 @@
               <w:ind w:left="0" w:firstLineChars="100" w:firstLine="210"/>
             </w:pPr>
             <w:r>
+              <w:lastRenderedPageBreak/>
               <w:t>[</w:t>
             </w:r>
           </w:p>
@@ -28324,7 +28412,6 @@
               <w:ind w:left="0" w:firstLineChars="300" w:firstLine="630"/>
             </w:pPr>
             <w:r>
-              <w:lastRenderedPageBreak/>
               <w:t>HostName:</w:t>
             </w:r>
             <w:r>
@@ -28422,6 +28509,7 @@
               <w:ind w:left="0" w:firstLineChars="100" w:firstLine="210"/>
             </w:pPr>
             <w:r>
+              <w:lastRenderedPageBreak/>
               <w:t>[</w:t>
             </w:r>
           </w:p>
@@ -28438,7 +28526,6 @@
               <w:ind w:left="0" w:firstLineChars="300" w:firstLine="630"/>
             </w:pPr>
             <w:r>
-              <w:lastRenderedPageBreak/>
               <w:t>HostName:"suse-lyb"</w:t>
             </w:r>
           </w:p>
@@ -29382,6 +29469,7 @@
               <w:rPr>
                 <w:rFonts w:hint="eastAsia"/>
               </w:rPr>
+              <w:lastRenderedPageBreak/>
               <w:t xml:space="preserve">    </w:t>
             </w:r>
             <w:r>
@@ -29446,7 +29534,6 @@
               <w:rPr>
                 <w:rFonts w:hint="eastAsia"/>
               </w:rPr>
-              <w:lastRenderedPageBreak/>
               <w:t xml:space="preserve">  }</w:t>
             </w:r>
           </w:p>
@@ -30278,6 +30365,7 @@
               <w:ind w:left="0" w:firstLineChars="400" w:firstLine="840"/>
             </w:pPr>
             <w:r>
+              <w:lastRenderedPageBreak/>
               <w:t xml:space="preserve">"Sys": { "Megabit": 15, "Unit": 308550 }, </w:t>
             </w:r>
           </w:p>
@@ -30286,24 +30374,254 @@
               <w:ind w:left="0" w:firstLineChars="400" w:firstLine="840"/>
             </w:pPr>
             <w:r>
+              <w:t>"Idle": { "Megabit": 9075, "Unit": 931030 },</w:t>
+            </w:r>
+          </w:p>
+          <w:p>
+            <w:pPr>
+              <w:ind w:left="0" w:firstLineChars="400" w:firstLine="840"/>
+            </w:pPr>
+            <w:r>
+              <w:t xml:space="preserve">"Other": { "Megabit": 66, "Unit": 384664 }, </w:t>
+            </w:r>
+          </w:p>
+          <w:p>
+            <w:pPr>
+              <w:ind w:left="0" w:firstLineChars="400" w:firstLine="840"/>
+            </w:pPr>
+            <w:r>
+              <w:t xml:space="preserve">"User": { "Megabit": 42, "Unit": 476078 } </w:t>
+            </w:r>
+          </w:p>
+          <w:p>
+            <w:pPr>
+              <w:ind w:left="0" w:firstLineChars="300" w:firstLine="630"/>
+            </w:pPr>
+            <w:r>
+              <w:t xml:space="preserve">}, </w:t>
+            </w:r>
+          </w:p>
+          <w:p>
+            <w:pPr>
+              <w:ind w:left="0" w:firstLineChars="300" w:firstLine="630"/>
+            </w:pPr>
+            <w:r>
+              <w:t xml:space="preserve">"Net": </w:t>
+            </w:r>
+          </w:p>
+          <w:p>
+            <w:pPr>
+              <w:ind w:left="0" w:firstLineChars="300" w:firstLine="630"/>
+            </w:pPr>
+            <w:r>
+              <w:t xml:space="preserve">{ </w:t>
+            </w:r>
+          </w:p>
+          <w:p>
+            <w:pPr>
+              <w:ind w:left="0" w:firstLineChars="400" w:firstLine="840"/>
+            </w:pPr>
+            <w:r>
+              <w:t xml:space="preserve">"CalendarTime": 1425101760, </w:t>
+            </w:r>
+          </w:p>
+          <w:p>
+            <w:pPr>
+              <w:ind w:left="0" w:firstLineChars="400" w:firstLine="840"/>
+            </w:pPr>
+            <w:r>
+              <w:t xml:space="preserve">"Net": </w:t>
+            </w:r>
+          </w:p>
+          <w:p>
+            <w:pPr>
+              <w:ind w:left="0" w:firstLineChars="400" w:firstLine="840"/>
+            </w:pPr>
+            <w:r>
+              <w:t xml:space="preserve">[ </w:t>
+            </w:r>
+          </w:p>
+          <w:p>
+            <w:pPr>
+              <w:ind w:left="0" w:firstLineChars="500" w:firstLine="1050"/>
+            </w:pPr>
+            <w:r>
+              <w:t xml:space="preserve">{ </w:t>
+            </w:r>
+          </w:p>
+          <w:p>
+            <w:pPr>
+              <w:ind w:left="0" w:firstLineChars="600" w:firstLine="1260"/>
+            </w:pPr>
+            <w:r>
+              <w:t xml:space="preserve">"Name": "lo", </w:t>
+            </w:r>
+          </w:p>
+          <w:p>
+            <w:pPr>
+              <w:ind w:left="0" w:firstLineChars="600" w:firstLine="1260"/>
+            </w:pPr>
+            <w:r>
+              <w:t xml:space="preserve">"RXBytes": { "Megabit": 5335, "Unit": 117938 }, </w:t>
+            </w:r>
+          </w:p>
+          <w:p>
+            <w:pPr>
+              <w:ind w:left="0" w:firstLineChars="600" w:firstLine="1260"/>
+            </w:pPr>
+            <w:r>
+              <w:t xml:space="preserve">"RXPackets": { "Megabit": 43, "Unit": 901867 }, </w:t>
+            </w:r>
+          </w:p>
+          <w:p>
+            <w:pPr>
+              <w:ind w:left="0" w:firstLineChars="600" w:firstLine="1260"/>
+            </w:pPr>
+            <w:r>
+              <w:t xml:space="preserve">"RXErrors": { "Megabit": 0, "Unit": 0 }, </w:t>
+            </w:r>
+          </w:p>
+          <w:p>
+            <w:pPr>
+              <w:ind w:left="0" w:firstLineChars="600" w:firstLine="1260"/>
+            </w:pPr>
+            <w:r>
+              <w:t xml:space="preserve">"RXDrops": { "Megabit": 0, "Unit": 0 }, </w:t>
+            </w:r>
+          </w:p>
+          <w:p>
+            <w:pPr>
+              <w:ind w:left="0" w:firstLineChars="600" w:firstLine="1260"/>
+            </w:pPr>
+            <w:r>
+              <w:t xml:space="preserve">"TXBytes": { "Megabit": 5335, "Unit": 117938 }, </w:t>
+            </w:r>
+          </w:p>
+          <w:p>
+            <w:pPr>
+              <w:ind w:left="0" w:firstLineChars="600" w:firstLine="1260"/>
+            </w:pPr>
+            <w:r>
+              <w:t xml:space="preserve">"TXPackets": { "Megabit": 43, "Unit": 901867 }, </w:t>
+            </w:r>
+          </w:p>
+          <w:p>
+            <w:pPr>
+              <w:ind w:left="0" w:firstLineChars="600" w:firstLine="1260"/>
+            </w:pPr>
+            <w:r>
+              <w:t xml:space="preserve">"TXErrors": { "Megabit": 0, "Unit": 0 }, </w:t>
+            </w:r>
+          </w:p>
+          <w:p>
+            <w:pPr>
+              <w:ind w:left="0" w:firstLineChars="600" w:firstLine="1260"/>
+            </w:pPr>
+            <w:r>
+              <w:t xml:space="preserve">"TXDrops": { "Megabit": 0, "Unit": 0 } </w:t>
+            </w:r>
+          </w:p>
+          <w:p>
+            <w:pPr>
+              <w:ind w:left="0" w:firstLineChars="450" w:firstLine="945"/>
+            </w:pPr>
+            <w:r>
+              <w:t xml:space="preserve">} </w:t>
+            </w:r>
+          </w:p>
+          <w:p>
+            <w:pPr>
+              <w:ind w:leftChars="170" w:firstLineChars="200" w:firstLine="420"/>
+            </w:pPr>
+            <w:r>
+              <w:rPr>
+                <w:rFonts w:hint="eastAsia"/>
+              </w:rPr>
+              <w:t>]</w:t>
+            </w:r>
+            <w:r>
+              <w:t xml:space="preserve"> </w:t>
+            </w:r>
+          </w:p>
+          <w:p>
+            <w:pPr>
+              <w:ind w:left="0" w:firstLineChars="300" w:firstLine="630"/>
+            </w:pPr>
+            <w:r>
+              <w:t xml:space="preserve">}, </w:t>
+            </w:r>
+          </w:p>
+          <w:p>
+            <w:pPr>
+              <w:ind w:left="0" w:firstLineChars="300" w:firstLine="630"/>
+            </w:pPr>
+            <w:r>
+              <w:t xml:space="preserve">"HostName": "suse-lyb", </w:t>
+            </w:r>
+          </w:p>
+          <w:p>
+            <w:pPr>
+              <w:ind w:left="0" w:firstLineChars="300" w:firstLine="630"/>
+            </w:pPr>
+            <w:r>
+              <w:t xml:space="preserve">"Memory": </w:t>
+            </w:r>
+          </w:p>
+          <w:p>
+            <w:pPr>
+              <w:ind w:left="0" w:firstLineChars="300" w:firstLine="630"/>
+            </w:pPr>
+            <w:r>
+              <w:t xml:space="preserve">{ </w:t>
+            </w:r>
+          </w:p>
+          <w:p>
+            <w:pPr>
+              <w:ind w:left="0" w:firstLineChars="400" w:firstLine="840"/>
+            </w:pPr>
+            <w:r>
+              <w:t xml:space="preserve">"Size": 1878, </w:t>
+            </w:r>
+          </w:p>
+          <w:p>
+            <w:pPr>
+              <w:ind w:left="0" w:firstLineChars="400" w:firstLine="840"/>
+            </w:pPr>
+            <w:r>
+              <w:t xml:space="preserve">"Free": 114, </w:t>
+            </w:r>
+          </w:p>
+          <w:p>
+            <w:pPr>
+              <w:ind w:left="0" w:firstLineChars="400" w:firstLine="840"/>
+            </w:pPr>
+            <w:r>
+              <w:t xml:space="preserve">"Used": 1764 </w:t>
+            </w:r>
+          </w:p>
+          <w:p>
+            <w:pPr>
+              <w:ind w:left="0" w:firstLineChars="300" w:firstLine="630"/>
+            </w:pPr>
+            <w:r>
+              <w:t xml:space="preserve">}, </w:t>
+            </w:r>
+          </w:p>
+          <w:p>
+            <w:pPr>
+              <w:ind w:left="0" w:firstLineChars="300" w:firstLine="630"/>
+            </w:pPr>
+            <w:r>
+              <w:t xml:space="preserve">"Disk": </w:t>
+            </w:r>
+          </w:p>
+          <w:p>
+            <w:pPr>
+              <w:ind w:left="0" w:firstLineChars="300" w:firstLine="630"/>
+            </w:pPr>
+            <w:r>
               <w:lastRenderedPageBreak/>
-              <w:t>"Idle": { "Megabit": 9075, "Unit": 931030 },</w:t>
-            </w:r>
-          </w:p>
-          <w:p>
-            <w:pPr>
-              <w:ind w:left="0" w:firstLineChars="400" w:firstLine="840"/>
-            </w:pPr>
-            <w:r>
-              <w:t xml:space="preserve">"Other": { "Megabit": 66, "Unit": 384664 }, </w:t>
-            </w:r>
-          </w:p>
-          <w:p>
-            <w:pPr>
-              <w:ind w:left="0" w:firstLineChars="400" w:firstLine="840"/>
-            </w:pPr>
-            <w:r>
-              <w:t xml:space="preserve">"User": { "Megabit": 42, "Unit": 476078 } </w:t>
+              <w:t xml:space="preserve">[ </w:t>
             </w:r>
           </w:p>
           <w:p>
@@ -30311,7 +30629,7 @@
               <w:ind w:left="0" w:firstLineChars="300" w:firstLine="630"/>
             </w:pPr>
             <w:r>
-              <w:t xml:space="preserve">}, </w:t>
+              <w:t xml:space="preserve">{ </w:t>
             </w:r>
           </w:p>
           <w:p>
@@ -30319,237 +30637,6 @@
               <w:ind w:left="0" w:firstLineChars="300" w:firstLine="630"/>
             </w:pPr>
             <w:r>
-              <w:t xml:space="preserve">"Net": </w:t>
-            </w:r>
-          </w:p>
-          <w:p>
-            <w:pPr>
-              <w:ind w:left="0" w:firstLineChars="300" w:firstLine="630"/>
-            </w:pPr>
-            <w:r>
-              <w:t xml:space="preserve">{ </w:t>
-            </w:r>
-          </w:p>
-          <w:p>
-            <w:pPr>
-              <w:ind w:left="0" w:firstLineChars="400" w:firstLine="840"/>
-            </w:pPr>
-            <w:r>
-              <w:t xml:space="preserve">"CalendarTime": 1425101760, </w:t>
-            </w:r>
-          </w:p>
-          <w:p>
-            <w:pPr>
-              <w:ind w:left="0" w:firstLineChars="400" w:firstLine="840"/>
-            </w:pPr>
-            <w:r>
-              <w:t xml:space="preserve">"Net": </w:t>
-            </w:r>
-          </w:p>
-          <w:p>
-            <w:pPr>
-              <w:ind w:left="0" w:firstLineChars="400" w:firstLine="840"/>
-            </w:pPr>
-            <w:r>
-              <w:t xml:space="preserve">[ </w:t>
-            </w:r>
-          </w:p>
-          <w:p>
-            <w:pPr>
-              <w:ind w:left="0" w:firstLineChars="500" w:firstLine="1050"/>
-            </w:pPr>
-            <w:r>
-              <w:t xml:space="preserve">{ </w:t>
-            </w:r>
-          </w:p>
-          <w:p>
-            <w:pPr>
-              <w:ind w:left="0" w:firstLineChars="600" w:firstLine="1260"/>
-            </w:pPr>
-            <w:r>
-              <w:t xml:space="preserve">"Name": "lo", </w:t>
-            </w:r>
-          </w:p>
-          <w:p>
-            <w:pPr>
-              <w:ind w:left="0" w:firstLineChars="600" w:firstLine="1260"/>
-            </w:pPr>
-            <w:r>
-              <w:t xml:space="preserve">"RXBytes": { "Megabit": 5335, "Unit": 117938 }, </w:t>
-            </w:r>
-          </w:p>
-          <w:p>
-            <w:pPr>
-              <w:ind w:left="0" w:firstLineChars="600" w:firstLine="1260"/>
-            </w:pPr>
-            <w:r>
-              <w:t xml:space="preserve">"RXPackets": { "Megabit": 43, "Unit": 901867 }, </w:t>
-            </w:r>
-          </w:p>
-          <w:p>
-            <w:pPr>
-              <w:ind w:left="0" w:firstLineChars="600" w:firstLine="1260"/>
-            </w:pPr>
-            <w:r>
-              <w:t xml:space="preserve">"RXErrors": { "Megabit": 0, "Unit": 0 }, </w:t>
-            </w:r>
-          </w:p>
-          <w:p>
-            <w:pPr>
-              <w:ind w:left="0" w:firstLineChars="600" w:firstLine="1260"/>
-            </w:pPr>
-            <w:r>
-              <w:t xml:space="preserve">"RXDrops": { "Megabit": 0, "Unit": 0 }, </w:t>
-            </w:r>
-          </w:p>
-          <w:p>
-            <w:pPr>
-              <w:ind w:left="0" w:firstLineChars="600" w:firstLine="1260"/>
-            </w:pPr>
-            <w:r>
-              <w:t xml:space="preserve">"TXBytes": { "Megabit": 5335, "Unit": 117938 }, </w:t>
-            </w:r>
-          </w:p>
-          <w:p>
-            <w:pPr>
-              <w:ind w:left="0" w:firstLineChars="600" w:firstLine="1260"/>
-            </w:pPr>
-            <w:r>
-              <w:t xml:space="preserve">"TXPackets": { "Megabit": 43, "Unit": 901867 }, </w:t>
-            </w:r>
-          </w:p>
-          <w:p>
-            <w:pPr>
-              <w:ind w:left="0" w:firstLineChars="600" w:firstLine="1260"/>
-            </w:pPr>
-            <w:r>
-              <w:t xml:space="preserve">"TXErrors": { "Megabit": 0, "Unit": 0 }, </w:t>
-            </w:r>
-          </w:p>
-          <w:p>
-            <w:pPr>
-              <w:ind w:left="0" w:firstLineChars="600" w:firstLine="1260"/>
-            </w:pPr>
-            <w:r>
-              <w:t xml:space="preserve">"TXDrops": { "Megabit": 0, "Unit": 0 } </w:t>
-            </w:r>
-          </w:p>
-          <w:p>
-            <w:pPr>
-              <w:ind w:left="0" w:firstLineChars="450" w:firstLine="945"/>
-            </w:pPr>
-            <w:r>
-              <w:t xml:space="preserve">} </w:t>
-            </w:r>
-          </w:p>
-          <w:p>
-            <w:pPr>
-              <w:ind w:leftChars="170" w:firstLineChars="200" w:firstLine="420"/>
-            </w:pPr>
-            <w:r>
-              <w:rPr>
-                <w:rFonts w:hint="eastAsia"/>
-              </w:rPr>
-              <w:t>]</w:t>
-            </w:r>
-            <w:r>
-              <w:t xml:space="preserve"> </w:t>
-            </w:r>
-          </w:p>
-          <w:p>
-            <w:pPr>
-              <w:ind w:left="0" w:firstLineChars="300" w:firstLine="630"/>
-            </w:pPr>
-            <w:r>
-              <w:t xml:space="preserve">}, </w:t>
-            </w:r>
-          </w:p>
-          <w:p>
-            <w:pPr>
-              <w:ind w:left="0" w:firstLineChars="300" w:firstLine="630"/>
-            </w:pPr>
-            <w:r>
-              <w:t xml:space="preserve">"HostName": "suse-lyb", </w:t>
-            </w:r>
-          </w:p>
-          <w:p>
-            <w:pPr>
-              <w:ind w:left="0" w:firstLineChars="300" w:firstLine="630"/>
-            </w:pPr>
-            <w:r>
-              <w:t xml:space="preserve">"Memory": </w:t>
-            </w:r>
-          </w:p>
-          <w:p>
-            <w:pPr>
-              <w:ind w:left="0" w:firstLineChars="300" w:firstLine="630"/>
-            </w:pPr>
-            <w:r>
-              <w:t xml:space="preserve">{ </w:t>
-            </w:r>
-          </w:p>
-          <w:p>
-            <w:pPr>
-              <w:ind w:left="0" w:firstLineChars="400" w:firstLine="840"/>
-            </w:pPr>
-            <w:r>
-              <w:t xml:space="preserve">"Size": 1878, </w:t>
-            </w:r>
-          </w:p>
-          <w:p>
-            <w:pPr>
-              <w:ind w:left="0" w:firstLineChars="400" w:firstLine="840"/>
-            </w:pPr>
-            <w:r>
-              <w:t xml:space="preserve">"Free": 114, </w:t>
-            </w:r>
-          </w:p>
-          <w:p>
-            <w:pPr>
-              <w:ind w:left="0" w:firstLineChars="400" w:firstLine="840"/>
-            </w:pPr>
-            <w:r>
-              <w:t xml:space="preserve">"Used": 1764 </w:t>
-            </w:r>
-          </w:p>
-          <w:p>
-            <w:pPr>
-              <w:ind w:left="0" w:firstLineChars="300" w:firstLine="630"/>
-            </w:pPr>
-            <w:r>
-              <w:t xml:space="preserve">}, </w:t>
-            </w:r>
-          </w:p>
-          <w:p>
-            <w:pPr>
-              <w:ind w:left="0" w:firstLineChars="300" w:firstLine="630"/>
-            </w:pPr>
-            <w:r>
-              <w:t xml:space="preserve">"Disk": </w:t>
-            </w:r>
-          </w:p>
-          <w:p>
-            <w:pPr>
-              <w:ind w:left="0" w:firstLineChars="300" w:firstLine="630"/>
-            </w:pPr>
-            <w:r>
-              <w:t xml:space="preserve">[ </w:t>
-            </w:r>
-          </w:p>
-          <w:p>
-            <w:pPr>
-              <w:ind w:left="0" w:firstLineChars="300" w:firstLine="630"/>
-            </w:pPr>
-            <w:r>
-              <w:t xml:space="preserve">{ </w:t>
-            </w:r>
-          </w:p>
-          <w:p>
-            <w:pPr>
-              <w:ind w:left="0" w:firstLineChars="300" w:firstLine="630"/>
-            </w:pPr>
-            <w:r>
-              <w:lastRenderedPageBreak/>
               <w:t xml:space="preserve">"Name": "/dev/mapper/vgdata-lvdata1", </w:t>
             </w:r>
           </w:p>
@@ -32251,20 +32338,73 @@
               <w:rPr>
                 <w:rFonts w:hint="eastAsia"/>
               </w:rPr>
-              <w:t>Filter</w:t>
-            </w:r>
-            <w:r>
-              <w:rPr>
-                <w:rFonts w:hint="eastAsia"/>
-              </w:rPr>
-              <w:t xml:space="preserve">: </w:t>
-            </w:r>
-            <w:r>
-              <w:rPr>
-                <w:rFonts w:hint="eastAsia"/>
-              </w:rPr>
-              <w:t>业务名</w:t>
-            </w:r>
+              <w:t>filter: object</w:t>
+            </w:r>
+          </w:p>
+          <w:p>
+            <w:pPr>
+              <w:ind w:left="0"/>
+            </w:pPr>
+            <w:r>
+              <w:rPr>
+                <w:rFonts w:hint="eastAsia"/>
+              </w:rPr>
+              <w:t>selector: object</w:t>
+            </w:r>
+          </w:p>
+          <w:p>
+            <w:pPr>
+              <w:ind w:left="0"/>
+            </w:pPr>
+            <w:r>
+              <w:rPr>
+                <w:rFonts w:hint="eastAsia"/>
+              </w:rPr>
+              <w:t>sort: object</w:t>
+            </w:r>
+          </w:p>
+          <w:p>
+            <w:pPr>
+              <w:ind w:left="0"/>
+              <w:rPr>
+                <w:ins w:id="59" w:author="xujianhui" w:date="2016-05-19T16:53:00Z"/>
+              </w:rPr>
+            </w:pPr>
+            <w:r>
+              <w:rPr>
+                <w:rFonts w:hint="eastAsia"/>
+              </w:rPr>
+              <w:t>hinter: object</w:t>
+            </w:r>
+          </w:p>
+          <w:p>
+            <w:pPr>
+              <w:ind w:left="0"/>
+              <w:rPr>
+                <w:ins w:id="60" w:author="xujianhui" w:date="2016-05-19T16:53:00Z"/>
+              </w:rPr>
+            </w:pPr>
+            <w:ins w:id="61" w:author="xujianhui" w:date="2016-05-19T16:53:00Z">
+              <w:r>
+                <w:rPr>
+                  <w:rFonts w:hint="eastAsia"/>
+                </w:rPr>
+                <w:t>skip:number</w:t>
+              </w:r>
+            </w:ins>
+          </w:p>
+          <w:p>
+            <w:pPr>
+              <w:ind w:left="0"/>
+            </w:pPr>
+            <w:ins w:id="62" w:author="xujianhui" w:date="2016-05-19T16:53:00Z">
+              <w:r>
+                <w:rPr>
+                  <w:rFonts w:hint="eastAsia"/>
+                </w:rPr>
+                <w:t>limit:number</w:t>
+              </w:r>
+            </w:ins>
           </w:p>
         </w:tc>
         <w:tc>
@@ -32432,6 +32572,7 @@
               <w:rPr>
                 <w:rFonts w:hint="eastAsia"/>
               </w:rPr>
+              <w:lastRenderedPageBreak/>
               <w:t>响应内容</w:t>
             </w:r>
           </w:p>
@@ -32563,7 +32704,6 @@
               <w:rPr>
                 <w:rFonts w:hint="eastAsia"/>
               </w:rPr>
-              <w:lastRenderedPageBreak/>
               <w:t>说明</w:t>
             </w:r>
           </w:p>
@@ -33114,6 +33254,7 @@
               <w:ind w:left="0"/>
             </w:pPr>
             <w:r>
+              <w:lastRenderedPageBreak/>
               <w:t>}</w:t>
             </w:r>
           </w:p>
@@ -33137,6 +33278,7 @@
               <w:rPr>
                 <w:rFonts w:hint="eastAsia"/>
               </w:rPr>
+              <w:lastRenderedPageBreak/>
               <w:t>说明</w:t>
             </w:r>
           </w:p>
@@ -33895,6 +34037,7 @@
         <w:rPr>
           <w:rFonts w:hint="eastAsia"/>
         </w:rPr>
+        <w:lastRenderedPageBreak/>
         <w:t>检测</w:t>
       </w:r>
       <w:r>
@@ -34123,7 +34266,6 @@
               <w:rPr>
                 <w:rFonts w:hint="eastAsia"/>
               </w:rPr>
-              <w:lastRenderedPageBreak/>
               <w:t>说明</w:t>
             </w:r>
           </w:p>
@@ -35117,6 +35259,7 @@
               <w:rPr>
                 <w:rFonts w:hint="eastAsia"/>
               </w:rPr>
+              <w:lastRenderedPageBreak/>
               <w:t>响应</w:t>
             </w:r>
           </w:p>
@@ -35459,7 +35602,6 @@
         <w:rPr>
           <w:rFonts w:hint="eastAsia"/>
         </w:rPr>
-        <w:lastRenderedPageBreak/>
         <w:t>安装临时</w:t>
       </w:r>
       <w:r>
@@ -36183,6 +36325,7 @@
         <w:rPr>
           <w:rFonts w:hint="eastAsia"/>
         </w:rPr>
+        <w:lastRenderedPageBreak/>
         <w:t>反安装临时</w:t>
       </w:r>
       <w:r>
@@ -36310,7 +36453,6 @@
         <w:rPr>
           <w:rFonts w:hint="eastAsia"/>
         </w:rPr>
-        <w:lastRenderedPageBreak/>
         <w:t xml:space="preserve">Story </w:t>
       </w:r>
       <w:r>
@@ -36617,6 +36759,7 @@
         <w:rPr>
           <w:rFonts w:hint="eastAsia"/>
         </w:rPr>
+        <w:lastRenderedPageBreak/>
         <w:t>验收</w:t>
       </w:r>
       <w:r>
@@ -36741,7 +36884,7 @@
         <w:tc>
           <w:tcPr>
             <w:tcW w:w="2527" w:type="dxa"/>
-            <w:shd w:val="clear" w:color="auto" w:fill="BFBFBF" w:themeFill="background1" w:themeFillShade="BF"/>
+            <w:shd w:val="clear" w:color="auto" w:fill="74D280" w:themeFill="background1" w:themeFillShade="BF"/>
           </w:tcPr>
           <w:p>
             <w:pPr>
@@ -36762,7 +36905,7 @@
         <w:tc>
           <w:tcPr>
             <w:tcW w:w="1511" w:type="dxa"/>
-            <w:shd w:val="clear" w:color="auto" w:fill="BFBFBF" w:themeFill="background1" w:themeFillShade="BF"/>
+            <w:shd w:val="clear" w:color="auto" w:fill="74D280" w:themeFill="background1" w:themeFillShade="BF"/>
           </w:tcPr>
           <w:p>
             <w:pPr>
@@ -36783,7 +36926,7 @@
         <w:tc>
           <w:tcPr>
             <w:tcW w:w="2376" w:type="dxa"/>
-            <w:shd w:val="clear" w:color="auto" w:fill="BFBFBF" w:themeFill="background1" w:themeFillShade="BF"/>
+            <w:shd w:val="clear" w:color="auto" w:fill="74D280" w:themeFill="background1" w:themeFillShade="BF"/>
           </w:tcPr>
           <w:p>
             <w:pPr>
@@ -36804,7 +36947,7 @@
         <w:tc>
           <w:tcPr>
             <w:tcW w:w="1751" w:type="dxa"/>
-            <w:shd w:val="clear" w:color="auto" w:fill="BFBFBF" w:themeFill="background1" w:themeFillShade="BF"/>
+            <w:shd w:val="clear" w:color="auto" w:fill="74D280" w:themeFill="background1" w:themeFillShade="BF"/>
           </w:tcPr>
           <w:p>
             <w:pPr>
@@ -37250,7 +37393,6 @@
               <w:rPr>
                 <w:rFonts w:hint="eastAsia"/>
               </w:rPr>
-              <w:lastRenderedPageBreak/>
               <w:t>资料是否变更</w:t>
             </w:r>
           </w:p>
@@ -40858,7 +41000,7 @@
         <a:sysClr val="windowText" lastClr="000000"/>
       </a:dk1>
       <a:lt1>
-        <a:sysClr val="window" lastClr="FFFFFF"/>
+        <a:sysClr val="window" lastClr="C7EDCC"/>
       </a:lt1>
       <a:dk2>
         <a:srgbClr val="1F497D"/>

</xml_diff>